<commit_message>
SRS-1.5 and 3.3 Completed
</commit_message>
<xml_diff>
--- a/documentation/02-Software-Requirements-Spec.docx
+++ b/documentation/02-Software-Requirements-Spec.docx
@@ -5,10 +5,23 @@
     <w:p>
       <w:pPr>
         <w:pStyle w:val="Title"/>
+        <w:ind w:left="2160" w:firstLine="720"/>
         <w:jc w:val="right"/>
       </w:pPr>
       <w:r>
+        <w:fldChar w:fldCharType="begin"/>
+      </w:r>
+      <w:r>
+        <w:instrText xml:space="preserve"> SUBJECT </w:instrText>
+      </w:r>
+      <w:r>
+        <w:fldChar w:fldCharType="separate"/>
+      </w:r>
+      <w:r>
         <w:t>Arithmetic Expression Evaluator C++</w:t>
+      </w:r>
+      <w:r>
+        <w:fldChar w:fldCharType="end"/>
       </w:r>
     </w:p>
     <w:p>
@@ -41,8 +54,22 @@
       <w:r>
         <w:rPr>
           <w:sz w:val="28"/>
-        </w:rPr>
-        <w:t>Version 1.0</w:t>
+          <w:highlight w:val="green"/>
+        </w:rPr>
+        <w:t xml:space="preserve">Version </w:t>
+      </w:r>
+      <w:r>
+        <w:rPr>
+          <w:sz w:val="28"/>
+          <w:highlight w:val="green"/>
+        </w:rPr>
+        <w:t>1.</w:t>
+      </w:r>
+      <w:r>
+        <w:rPr>
+          <w:sz w:val="28"/>
+        </w:rPr>
+        <w:t>1</w:t>
       </w:r>
     </w:p>
     <w:p>
@@ -197,7 +224,13 @@
               <w:pStyle w:val="Tabletext"/>
             </w:pPr>
             <w:r>
-              <w:t>10/03/2026</w:t>
+              <w:t>03/</w:t>
+            </w:r>
+            <w:r>
+              <w:t>M</w:t>
+            </w:r>
+            <w:r>
+              <w:t>ar/26</w:t>
             </w:r>
           </w:p>
         </w:tc>
@@ -210,7 +243,10 @@
               <w:pStyle w:val="Tabletext"/>
             </w:pPr>
             <w:r>
-              <w:t>1.0</w:t>
+              <w:t>1.</w:t>
+            </w:r>
+            <w:r>
+              <w:t>1</w:t>
             </w:r>
           </w:p>
         </w:tc>
@@ -223,7 +259,7 @@
               <w:pStyle w:val="Tabletext"/>
             </w:pPr>
             <w:r>
-              <w:t>Added content for sections 1.2 and 3.3</w:t>
+              <w:t>Added content for sections 1.5 and 3.3.</w:t>
             </w:r>
           </w:p>
         </w:tc>
@@ -236,7 +272,7 @@
               <w:pStyle w:val="Tabletext"/>
             </w:pPr>
             <w:r>
-              <w:t>Eric F.</w:t>
+              <w:t>John P.</w:t>
             </w:r>
           </w:p>
         </w:tc>
@@ -706,22 +742,7 @@
         <w:tab/>
       </w:r>
       <w:r>
-        <w:fldChar w:fldCharType="begin"/>
-      </w:r>
-      <w:r>
-        <w:instrText xml:space="preserve"> PAGEREF _Toc5537893 \h </w:instrText>
-      </w:r>
-      <w:r>
-        <w:fldChar w:fldCharType="separate"/>
-      </w:r>
-      <w:r>
-        <w:rPr>
-          <w:noProof/>
-        </w:rPr>
-        <w:t>5</w:t>
-      </w:r>
-      <w:r>
-        <w:fldChar w:fldCharType="end"/>
+        <w:t>6</w:t>
       </w:r>
     </w:p>
     <w:p>
@@ -752,22 +773,7 @@
         <w:tab/>
       </w:r>
       <w:r>
-        <w:fldChar w:fldCharType="begin"/>
-      </w:r>
-      <w:r>
-        <w:instrText xml:space="preserve"> PAGEREF _Toc5537894 \h </w:instrText>
-      </w:r>
-      <w:r>
-        <w:fldChar w:fldCharType="separate"/>
-      </w:r>
-      <w:r>
-        <w:rPr>
-          <w:noProof/>
-        </w:rPr>
-        <w:t>5</w:t>
-      </w:r>
-      <w:r>
-        <w:fldChar w:fldCharType="end"/>
+        <w:t>6</w:t>
       </w:r>
     </w:p>
     <w:p>
@@ -801,22 +807,7 @@
         <w:tab/>
       </w:r>
       <w:r>
-        <w:fldChar w:fldCharType="begin"/>
-      </w:r>
-      <w:r>
-        <w:instrText xml:space="preserve"> PAGEREF _Toc5537895 \h </w:instrText>
-      </w:r>
-      <w:r>
-        <w:fldChar w:fldCharType="separate"/>
-      </w:r>
-      <w:r>
-        <w:rPr>
-          <w:noProof/>
-        </w:rPr>
-        <w:t>5</w:t>
-      </w:r>
-      <w:r>
-        <w:fldChar w:fldCharType="end"/>
+        <w:t>6</w:t>
       </w:r>
     </w:p>
     <w:p>
@@ -847,22 +838,7 @@
         <w:tab/>
       </w:r>
       <w:r>
-        <w:fldChar w:fldCharType="begin"/>
-      </w:r>
-      <w:r>
-        <w:instrText xml:space="preserve"> PAGEREF _Toc5537896 \h </w:instrText>
-      </w:r>
-      <w:r>
-        <w:fldChar w:fldCharType="separate"/>
-      </w:r>
-      <w:r>
-        <w:rPr>
-          <w:noProof/>
-        </w:rPr>
-        <w:t>5</w:t>
-      </w:r>
-      <w:r>
-        <w:fldChar w:fldCharType="end"/>
+        <w:t>6</w:t>
       </w:r>
     </w:p>
     <w:p>
@@ -893,22 +869,7 @@
         <w:tab/>
       </w:r>
       <w:r>
-        <w:fldChar w:fldCharType="begin"/>
-      </w:r>
-      <w:r>
-        <w:instrText xml:space="preserve"> PAGEREF _Toc5537897 \h </w:instrText>
-      </w:r>
-      <w:r>
-        <w:fldChar w:fldCharType="separate"/>
-      </w:r>
-      <w:r>
-        <w:rPr>
-          <w:noProof/>
-        </w:rPr>
-        <w:t>5</w:t>
-      </w:r>
-      <w:r>
-        <w:fldChar w:fldCharType="end"/>
+        <w:t>6</w:t>
       </w:r>
     </w:p>
     <w:p>
@@ -939,22 +900,7 @@
         <w:tab/>
       </w:r>
       <w:r>
-        <w:fldChar w:fldCharType="begin"/>
-      </w:r>
-      <w:r>
-        <w:instrText xml:space="preserve"> PAGEREF _Toc5537898 \h </w:instrText>
-      </w:r>
-      <w:r>
-        <w:fldChar w:fldCharType="separate"/>
-      </w:r>
-      <w:r>
-        <w:rPr>
-          <w:noProof/>
-        </w:rPr>
-        <w:t>5</w:t>
-      </w:r>
-      <w:r>
-        <w:fldChar w:fldCharType="end"/>
+        <w:t>6</w:t>
       </w:r>
     </w:p>
     <w:p>
@@ -985,22 +931,7 @@
         <w:tab/>
       </w:r>
       <w:r>
-        <w:fldChar w:fldCharType="begin"/>
-      </w:r>
-      <w:r>
-        <w:instrText xml:space="preserve"> PAGEREF _Toc5537899 \h </w:instrText>
-      </w:r>
-      <w:r>
-        <w:fldChar w:fldCharType="separate"/>
-      </w:r>
-      <w:r>
-        <w:rPr>
-          <w:noProof/>
-        </w:rPr>
-        <w:t>5</w:t>
-      </w:r>
-      <w:r>
-        <w:fldChar w:fldCharType="end"/>
+        <w:t>6</w:t>
       </w:r>
     </w:p>
     <w:p>
@@ -1031,22 +962,7 @@
         <w:tab/>
       </w:r>
       <w:r>
-        <w:fldChar w:fldCharType="begin"/>
-      </w:r>
-      <w:r>
-        <w:instrText xml:space="preserve"> PAGEREF _Toc5537900 \h </w:instrText>
-      </w:r>
-      <w:r>
-        <w:fldChar w:fldCharType="separate"/>
-      </w:r>
-      <w:r>
-        <w:rPr>
-          <w:noProof/>
-        </w:rPr>
-        <w:t>5</w:t>
-      </w:r>
-      <w:r>
-        <w:fldChar w:fldCharType="end"/>
+        <w:t>6</w:t>
       </w:r>
     </w:p>
     <w:p>
@@ -1077,22 +993,7 @@
         <w:tab/>
       </w:r>
       <w:r>
-        <w:fldChar w:fldCharType="begin"/>
-      </w:r>
-      <w:r>
-        <w:instrText xml:space="preserve"> PAGEREF _Toc5537901 \h </w:instrText>
-      </w:r>
-      <w:r>
-        <w:fldChar w:fldCharType="separate"/>
-      </w:r>
-      <w:r>
-        <w:rPr>
-          <w:noProof/>
-        </w:rPr>
-        <w:t>5</w:t>
-      </w:r>
-      <w:r>
-        <w:fldChar w:fldCharType="end"/>
+        <w:t>6</w:t>
       </w:r>
     </w:p>
     <w:p>
@@ -1123,22 +1024,7 @@
         <w:tab/>
       </w:r>
       <w:r>
-        <w:fldChar w:fldCharType="begin"/>
-      </w:r>
-      <w:r>
-        <w:instrText xml:space="preserve"> PAGEREF _Toc5537902 \h </w:instrText>
-      </w:r>
-      <w:r>
-        <w:fldChar w:fldCharType="separate"/>
-      </w:r>
-      <w:r>
-        <w:rPr>
-          <w:noProof/>
-        </w:rPr>
-        <w:t>5</w:t>
-      </w:r>
-      <w:r>
-        <w:fldChar w:fldCharType="end"/>
+        <w:t>6</w:t>
       </w:r>
     </w:p>
     <w:p>
@@ -1169,22 +1055,7 @@
         <w:tab/>
       </w:r>
       <w:r>
-        <w:fldChar w:fldCharType="begin"/>
-      </w:r>
-      <w:r>
-        <w:instrText xml:space="preserve"> PAGEREF _Toc5537903 \h </w:instrText>
-      </w:r>
-      <w:r>
-        <w:fldChar w:fldCharType="separate"/>
-      </w:r>
-      <w:r>
-        <w:rPr>
-          <w:noProof/>
-        </w:rPr>
-        <w:t>5</w:t>
-      </w:r>
-      <w:r>
-        <w:fldChar w:fldCharType="end"/>
+        <w:t>6</w:t>
       </w:r>
     </w:p>
     <w:p>
@@ -1215,22 +1086,7 @@
         <w:tab/>
       </w:r>
       <w:r>
-        <w:fldChar w:fldCharType="begin"/>
-      </w:r>
-      <w:r>
-        <w:instrText xml:space="preserve"> PAGEREF _Toc5537904 \h </w:instrText>
-      </w:r>
-      <w:r>
-        <w:fldChar w:fldCharType="separate"/>
-      </w:r>
-      <w:r>
-        <w:rPr>
-          <w:noProof/>
-        </w:rPr>
-        <w:t>5</w:t>
-      </w:r>
-      <w:r>
-        <w:fldChar w:fldCharType="end"/>
+        <w:t>6</w:t>
       </w:r>
     </w:p>
     <w:p>
@@ -1261,22 +1117,7 @@
         <w:tab/>
       </w:r>
       <w:r>
-        <w:fldChar w:fldCharType="begin"/>
-      </w:r>
-      <w:r>
-        <w:instrText xml:space="preserve"> PAGEREF _Toc5537905 \h </w:instrText>
-      </w:r>
-      <w:r>
-        <w:fldChar w:fldCharType="separate"/>
-      </w:r>
-      <w:r>
-        <w:rPr>
-          <w:noProof/>
-        </w:rPr>
-        <w:t>5</w:t>
-      </w:r>
-      <w:r>
-        <w:fldChar w:fldCharType="end"/>
+        <w:t>6</w:t>
       </w:r>
     </w:p>
     <w:p>
@@ -1307,22 +1148,7 @@
         <w:tab/>
       </w:r>
       <w:r>
-        <w:fldChar w:fldCharType="begin"/>
-      </w:r>
-      <w:r>
-        <w:instrText xml:space="preserve"> PAGEREF _Toc5537906 \h </w:instrText>
-      </w:r>
-      <w:r>
-        <w:fldChar w:fldCharType="separate"/>
-      </w:r>
-      <w:r>
-        <w:rPr>
-          <w:noProof/>
-        </w:rPr>
-        <w:t>5</w:t>
-      </w:r>
-      <w:r>
-        <w:fldChar w:fldCharType="end"/>
+        <w:t>6</w:t>
       </w:r>
     </w:p>
     <w:p>
@@ -1359,22 +1185,7 @@
         <w:tab/>
       </w:r>
       <w:r>
-        <w:fldChar w:fldCharType="begin"/>
-      </w:r>
-      <w:r>
-        <w:instrText xml:space="preserve"> PAGEREF _Toc5537907 \h </w:instrText>
-      </w:r>
-      <w:r>
-        <w:fldChar w:fldCharType="separate"/>
-      </w:r>
-      <w:r>
-        <w:rPr>
-          <w:noProof/>
-        </w:rPr>
-        <w:t>5</w:t>
-      </w:r>
-      <w:r>
-        <w:fldChar w:fldCharType="end"/>
+        <w:t>6</w:t>
       </w:r>
     </w:p>
     <w:p>
@@ -1405,22 +1216,7 @@
         <w:tab/>
       </w:r>
       <w:r>
-        <w:fldChar w:fldCharType="begin"/>
-      </w:r>
-      <w:r>
-        <w:instrText xml:space="preserve"> PAGEREF _Toc5537908 \h </w:instrText>
-      </w:r>
-      <w:r>
-        <w:fldChar w:fldCharType="separate"/>
-      </w:r>
-      <w:r>
-        <w:rPr>
-          <w:noProof/>
-        </w:rPr>
-        <w:t>5</w:t>
-      </w:r>
-      <w:r>
-        <w:fldChar w:fldCharType="end"/>
+        <w:t>6</w:t>
       </w:r>
     </w:p>
     <w:p>
@@ -1451,22 +1247,7 @@
         <w:tab/>
       </w:r>
       <w:r>
-        <w:fldChar w:fldCharType="begin"/>
-      </w:r>
-      <w:r>
-        <w:instrText xml:space="preserve"> PAGEREF _Toc5537909 \h </w:instrText>
-      </w:r>
-      <w:r>
-        <w:fldChar w:fldCharType="separate"/>
-      </w:r>
-      <w:r>
-        <w:rPr>
-          <w:noProof/>
-        </w:rPr>
-        <w:t>6</w:t>
-      </w:r>
-      <w:r>
-        <w:fldChar w:fldCharType="end"/>
+        <w:t>7</w:t>
       </w:r>
     </w:p>
     <w:p>
@@ -1497,22 +1278,7 @@
         <w:tab/>
       </w:r>
       <w:r>
-        <w:fldChar w:fldCharType="begin"/>
-      </w:r>
-      <w:r>
-        <w:instrText xml:space="preserve"> PAGEREF _Toc5537910 \h </w:instrText>
-      </w:r>
-      <w:r>
-        <w:fldChar w:fldCharType="separate"/>
-      </w:r>
-      <w:r>
-        <w:rPr>
-          <w:noProof/>
-        </w:rPr>
-        <w:t>6</w:t>
-      </w:r>
-      <w:r>
-        <w:fldChar w:fldCharType="end"/>
+        <w:t>7</w:t>
       </w:r>
     </w:p>
     <w:p>
@@ -1521,62 +1287,246 @@
         <w:tabs>
           <w:tab w:val="left" w:pos="1000"/>
         </w:tabs>
+      </w:pPr>
+      <w:r>
+        <w:t>3.3</w:t>
+      </w:r>
+      <w:r>
         <w:rPr>
           <w:sz w:val="24"/>
           <w:szCs w:val="24"/>
         </w:rPr>
-      </w:pPr>
-      <w:r>
-        <w:t>3.3</w:t>
-      </w:r>
-      <w:r>
+        <w:tab/>
+      </w:r>
+      <w:r>
+        <w:t>Supplementary Requirements</w:t>
+      </w:r>
+      <w:r>
+        <w:t xml:space="preserve"> </w:t>
+      </w:r>
+      <w:r>
+        <w:tab/>
+        <w:t>7</w:t>
+      </w:r>
+    </w:p>
+    <w:p>
+      <w:pPr>
+        <w:pStyle w:val="TOC2"/>
+        <w:tabs>
+          <w:tab w:val="left" w:pos="1000"/>
+        </w:tabs>
+      </w:pPr>
+      <w:r>
+        <w:t xml:space="preserve">         3.3.1  </w:t>
+      </w:r>
+      <w:r>
+        <w:t xml:space="preserve"> </w:t>
+      </w:r>
+      <w:r>
+        <w:t>Usability</w:t>
+      </w:r>
+      <w:r>
+        <w:t xml:space="preserve"> </w:t>
+      </w:r>
+      <w:r>
+        <w:tab/>
+      </w:r>
+      <w:r>
+        <w:t>7</w:t>
+      </w:r>
+    </w:p>
+    <w:p>
+      <w:pPr>
+        <w:pStyle w:val="TOC2"/>
+        <w:tabs>
+          <w:tab w:val="left" w:pos="1000"/>
+        </w:tabs>
+      </w:pPr>
+      <w:r>
+        <w:t xml:space="preserve">         3.3.2   Performance</w:t>
+      </w:r>
+      <w:r>
+        <w:tab/>
+      </w:r>
+      <w:r>
+        <w:t>7</w:t>
+      </w:r>
+    </w:p>
+    <w:p>
+      <w:r>
+        <w:tab/>
+        <w:t xml:space="preserve">   3.3.3   Reliability</w:t>
+      </w:r>
+      <w:r>
+        <w:t xml:space="preserve"> </w:t>
+      </w:r>
+      <w:r>
+        <w:tab/>
+      </w:r>
+      <w:r>
+        <w:tab/>
+      </w:r>
+      <w:r>
+        <w:tab/>
+      </w:r>
+      <w:r>
+        <w:tab/>
+      </w:r>
+      <w:r>
+        <w:tab/>
+      </w:r>
+      <w:r>
+        <w:tab/>
+      </w:r>
+      <w:r>
+        <w:tab/>
+      </w:r>
+      <w:r>
+        <w:tab/>
+      </w:r>
+      <w:r>
+        <w:tab/>
+        <w:t xml:space="preserve">            </w:t>
+      </w:r>
+      <w:r>
+        <w:t>7</w:t>
+      </w:r>
+    </w:p>
+    <w:p>
+      <w:r>
+        <w:tab/>
+        <w:t xml:space="preserve">   3.3.4   Portability </w:t>
+      </w:r>
+      <w:r>
+        <w:tab/>
+      </w:r>
+      <w:r>
+        <w:tab/>
+      </w:r>
+      <w:r>
+        <w:tab/>
+      </w:r>
+      <w:r>
+        <w:tab/>
+      </w:r>
+      <w:r>
+        <w:tab/>
+      </w:r>
+      <w:r>
+        <w:tab/>
+      </w:r>
+      <w:r>
+        <w:tab/>
+      </w:r>
+      <w:r>
+        <w:tab/>
+      </w:r>
+      <w:r>
+        <w:tab/>
+        <w:t xml:space="preserve">            </w:t>
+      </w:r>
+      <w:r>
+        <w:t>7</w:t>
+      </w:r>
+    </w:p>
+    <w:p>
+      <w:r>
+        <w:tab/>
+        <w:t xml:space="preserve">   3.3.5   Constraints </w:t>
+      </w:r>
+      <w:r>
+        <w:tab/>
+      </w:r>
+      <w:r>
+        <w:tab/>
+      </w:r>
+      <w:r>
+        <w:tab/>
+      </w:r>
+      <w:r>
+        <w:tab/>
+      </w:r>
+      <w:r>
+        <w:tab/>
+      </w:r>
+      <w:r>
+        <w:tab/>
+      </w:r>
+      <w:r>
+        <w:tab/>
+      </w:r>
+      <w:r>
+        <w:tab/>
+      </w:r>
+      <w:r>
+        <w:tab/>
+        <w:t xml:space="preserve">            </w:t>
+      </w:r>
+      <w:r>
+        <w:t>7</w:t>
+      </w:r>
+    </w:p>
+    <w:p>
+      <w:pPr>
+        <w:pStyle w:val="TOC1"/>
+        <w:tabs>
+          <w:tab w:val="left" w:pos="432"/>
+        </w:tabs>
         <w:rPr>
           <w:sz w:val="24"/>
           <w:szCs w:val="24"/>
         </w:rPr>
-        <w:tab/>
-      </w:r>
-      <w:r>
-        <w:t>Supplementary Requirements</w:t>
-      </w:r>
-      <w:r>
-        <w:tab/>
-      </w:r>
-      <w:r>
-        <w:fldChar w:fldCharType="begin"/>
-      </w:r>
-      <w:r>
-        <w:instrText xml:space="preserve"> PAGEREF _Toc5537911 \h </w:instrText>
-      </w:r>
-      <w:r>
-        <w:fldChar w:fldCharType="separate"/>
-      </w:r>
-      <w:r>
-        <w:rPr>
-          <w:noProof/>
-        </w:rPr>
-        <w:t>6</w:t>
-      </w:r>
-      <w:r>
-        <w:fldChar w:fldCharType="end"/>
-      </w:r>
-    </w:p>
-    <w:p>
-      <w:pPr>
-        <w:pStyle w:val="TOC1"/>
-        <w:tabs>
-          <w:tab w:val="left" w:pos="432"/>
-        </w:tabs>
+      </w:pPr>
+      <w:r>
+        <w:rPr>
+          <w:szCs w:val="24"/>
+        </w:rPr>
+        <w:t>4.</w:t>
+      </w:r>
+      <w:r>
         <w:rPr>
           <w:sz w:val="24"/>
           <w:szCs w:val="24"/>
         </w:rPr>
-      </w:pPr>
+        <w:tab/>
+      </w:r>
       <w:r>
         <w:rPr>
           <w:szCs w:val="24"/>
         </w:rPr>
-        <w:t>4.</w:t>
+        <w:t xml:space="preserve">Classification of </w:t>
+      </w:r>
+      <w:r>
+        <w:rPr>
+          <w:szCs w:val="24"/>
+        </w:rPr>
+        <w:t>Functional</w:t>
+      </w:r>
+      <w:r>
+        <w:rPr>
+          <w:szCs w:val="24"/>
+        </w:rPr>
+        <w:t xml:space="preserve"> Requirements</w:t>
+      </w:r>
+      <w:r>
+        <w:tab/>
+      </w:r>
+      <w:r>
+        <w:t>7</w:t>
+      </w:r>
+    </w:p>
+    <w:p>
+      <w:pPr>
+        <w:pStyle w:val="TOC1"/>
+        <w:tabs>
+          <w:tab w:val="left" w:pos="432"/>
+        </w:tabs>
+      </w:pPr>
+      <w:r>
+        <w:rPr>
+          <w:szCs w:val="24"/>
+        </w:rPr>
+        <w:t>5.</w:t>
       </w:r>
       <w:r>
         <w:rPr>
@@ -1589,88 +1539,13 @@
         <w:rPr>
           <w:szCs w:val="24"/>
         </w:rPr>
-        <w:t xml:space="preserve">Classification of </w:t>
-      </w:r>
-      <w:r>
-        <w:rPr>
-          <w:szCs w:val="24"/>
-        </w:rPr>
-        <w:t>Functional</w:t>
-      </w:r>
-      <w:r>
-        <w:rPr>
-          <w:szCs w:val="24"/>
-        </w:rPr>
-        <w:t xml:space="preserve"> Requirements</w:t>
-      </w:r>
-      <w:r>
-        <w:tab/>
-      </w:r>
-      <w:r>
-        <w:fldChar w:fldCharType="begin"/>
-      </w:r>
-      <w:r>
-        <w:instrText xml:space="preserve"> PAGEREF _Toc5537912 \h </w:instrText>
-      </w:r>
-      <w:r>
-        <w:fldChar w:fldCharType="separate"/>
-      </w:r>
-      <w:r>
-        <w:rPr>
-          <w:noProof/>
-        </w:rPr>
-        <w:t>6</w:t>
-      </w:r>
-      <w:r>
-        <w:fldChar w:fldCharType="end"/>
-      </w:r>
-    </w:p>
-    <w:p>
-      <w:pPr>
-        <w:pStyle w:val="TOC1"/>
-        <w:tabs>
-          <w:tab w:val="left" w:pos="432"/>
-        </w:tabs>
-      </w:pPr>
-      <w:r>
-        <w:rPr>
-          <w:szCs w:val="24"/>
-        </w:rPr>
-        <w:t>5.</w:t>
-      </w:r>
-      <w:r>
-        <w:rPr>
-          <w:sz w:val="24"/>
-          <w:szCs w:val="24"/>
-        </w:rPr>
-        <w:tab/>
-      </w:r>
-      <w:r>
-        <w:rPr>
-          <w:szCs w:val="24"/>
-        </w:rPr>
         <w:t>Appendices</w:t>
       </w:r>
       <w:r>
         <w:tab/>
       </w:r>
       <w:r>
-        <w:fldChar w:fldCharType="begin"/>
-      </w:r>
-      <w:r>
-        <w:instrText xml:space="preserve"> PAGEREF _Toc5537913 \h </w:instrText>
-      </w:r>
-      <w:r>
-        <w:fldChar w:fldCharType="separate"/>
-      </w:r>
-      <w:r>
-        <w:rPr>
-          <w:noProof/>
-        </w:rPr>
-        <w:t>6</w:t>
-      </w:r>
-      <w:r>
-        <w:fldChar w:fldCharType="end"/>
+        <w:t>8</w:t>
       </w:r>
     </w:p>
     <w:p/>
@@ -1857,20 +1732,20 @@
     </w:p>
     <w:p>
       <w:pPr>
-        <w:ind w:left="720" w:firstLine="720"/>
-      </w:pPr>
-      <w:r>
-        <w:t xml:space="preserve">This Software Requirements Specification (SRS) describes the requirements for a </w:t>
+        <w:pStyle w:val="InfoBlue"/>
+      </w:pPr>
+      <w:r>
+        <w:t xml:space="preserve">[A brief description of the software application that the </w:t>
       </w:r>
       <w:r>
         <w:rPr>
           <w:b/>
           <w:bCs/>
         </w:rPr>
-        <w:t>C++ Arithmetic Expression Evaluator</w:t>
-      </w:r>
-      <w:r>
-        <w:t>. The application allows users to input arithmetic expressions containing numbers, operators (+, −, *, /), and parentheses, and computes the correct result according to standard order of operations. The system will process user input, evaluate the expression, and display the calculated output through a command-line interface. This document defines the functional behavior of the system, including expression parsing, evaluation, and basic error handling for invalid input. The system is limited to evaluating basic arithmetic expressions and does not include advanced mathematical functions or graphical interfaces.</w:t>
+        <w:t>SRS</w:t>
+      </w:r>
+      <w:r>
+        <w:t xml:space="preserve"> applies to, the feature or other subsystem grouping, what Use-Case model(s) it is associated with, and anything else that is affected or influenced by this document.]</w:t>
       </w:r>
     </w:p>
     <w:p>
@@ -1941,20 +1816,292 @@
     </w:p>
     <w:p>
       <w:pPr>
-        <w:pStyle w:val="InfoBlue"/>
-      </w:pPr>
-      <w:r>
-        <w:t xml:space="preserve">[This subsection describes what the rest of the </w:t>
-      </w:r>
+        <w:pStyle w:val="BodyText"/>
+      </w:pPr>
+      <w:r>
+        <w:t xml:space="preserve">The SRS </w:t>
+      </w:r>
+      <w:r>
+        <w:t xml:space="preserve">describes what the arithmetic expression parser should </w:t>
+      </w:r>
+      <w:r>
+        <w:t>accomplish</w:t>
+      </w:r>
+      <w:r>
+        <w:t>, including</w:t>
+      </w:r>
+      <w:r>
+        <w:t xml:space="preserve"> its</w:t>
+      </w:r>
+      <w:r>
+        <w:t xml:space="preserve"> key features, services, and performance </w:t>
+      </w:r>
+      <w:r>
+        <w:t>objectives</w:t>
+      </w:r>
+      <w:r>
+        <w:t xml:space="preserve">. </w:t>
+      </w:r>
+      <w:r>
+        <w:t>It</w:t>
+      </w:r>
+      <w:r>
+        <w:t xml:space="preserve"> identifies </w:t>
+      </w:r>
+      <w:r>
+        <w:t>and documents</w:t>
+      </w:r>
+      <w:r>
+        <w:t xml:space="preserve"> the purpose </w:t>
+      </w:r>
+      <w:r>
+        <w:t>of</w:t>
+      </w:r>
+      <w:r>
+        <w:t xml:space="preserve"> the arithmetic expression evaluator</w:t>
+      </w:r>
+      <w:r>
+        <w:t xml:space="preserve"> and specifies</w:t>
+      </w:r>
+      <w:r>
+        <w:t xml:space="preserve"> the capabilities </w:t>
+      </w:r>
+      <w:r>
+        <w:t>the</w:t>
+      </w:r>
+      <w:r>
+        <w:t xml:space="preserve"> software must </w:t>
+      </w:r>
+      <w:r>
+        <w:t xml:space="preserve">provide, as well as </w:t>
+      </w:r>
+      <w:r>
+        <w:t xml:space="preserve">the services </w:t>
+      </w:r>
+      <w:r>
+        <w:t>it will deliver.</w:t>
+      </w:r>
+      <w:r>
+        <w:t xml:space="preserve"> </w:t>
+      </w:r>
+    </w:p>
+    <w:p>
+      <w:pPr>
+        <w:pStyle w:val="BodyText"/>
+      </w:pPr>
+      <w:r>
+        <w:t>This document is organized to provide a structured understanding of the expression evaluator and its requirements:</w:t>
+      </w:r>
+    </w:p>
+    <w:p>
+      <w:pPr>
+        <w:pStyle w:val="BodyText"/>
+        <w:numPr>
+          <w:ilvl w:val="0"/>
+          <w:numId w:val="56"/>
+        </w:numPr>
+      </w:pPr>
       <w:r>
         <w:rPr>
           <w:b/>
           <w:bCs/>
         </w:rPr>
-        <w:t>SRS</w:t>
-      </w:r>
-      <w:r>
-        <w:t xml:space="preserve"> contains and explains how the document is organized.]</w:t>
+        <w:t>Section 1 – Introduction</w:t>
+      </w:r>
+      <w:r>
+        <w:t xml:space="preserve">: Establishes the purpose, scope, key terms, references, and context </w:t>
+      </w:r>
+      <w:r>
+        <w:t>of</w:t>
+      </w:r>
+      <w:r>
+        <w:t xml:space="preserve"> the SRS</w:t>
+      </w:r>
+      <w:r>
+        <w:t xml:space="preserve"> using subsections for each</w:t>
+      </w:r>
+      <w:r>
+        <w:t>.</w:t>
+      </w:r>
+    </w:p>
+    <w:p>
+      <w:pPr>
+        <w:pStyle w:val="BodyText"/>
+        <w:numPr>
+          <w:ilvl w:val="0"/>
+          <w:numId w:val="56"/>
+        </w:numPr>
+      </w:pPr>
+      <w:r>
+        <w:rPr>
+          <w:b/>
+          <w:bCs/>
+        </w:rPr>
+        <w:t>Section 2 – Overall Description:</w:t>
+      </w:r>
+      <w:r>
+        <w:t xml:space="preserve"> </w:t>
+      </w:r>
+      <w:r>
+        <w:t>Provides</w:t>
+      </w:r>
+      <w:r>
+        <w:t xml:space="preserve"> background information and general detail</w:t>
+      </w:r>
+      <w:r>
+        <w:t>s</w:t>
+      </w:r>
+      <w:r>
+        <w:t xml:space="preserve"> </w:t>
+      </w:r>
+      <w:r>
+        <w:t>to support</w:t>
+      </w:r>
+      <w:r>
+        <w:t xml:space="preserve"> understanding of</w:t>
+      </w:r>
+      <w:r>
+        <w:t xml:space="preserve"> the </w:t>
+      </w:r>
+      <w:r>
+        <w:t xml:space="preserve">software </w:t>
+      </w:r>
+      <w:r>
+        <w:t>requirements</w:t>
+      </w:r>
+      <w:r>
+        <w:t xml:space="preserve">, including product perspective, product functions, user characteristics, </w:t>
+      </w:r>
+      <w:r>
+        <w:t>constraints, and assumptions.</w:t>
+      </w:r>
+    </w:p>
+    <w:p>
+      <w:pPr>
+        <w:pStyle w:val="BodyText"/>
+        <w:numPr>
+          <w:ilvl w:val="0"/>
+          <w:numId w:val="56"/>
+        </w:numPr>
+      </w:pPr>
+      <w:r>
+        <w:rPr>
+          <w:b/>
+          <w:bCs/>
+        </w:rPr>
+        <w:lastRenderedPageBreak/>
+        <w:t>Section 3 – Specific Requirements:</w:t>
+      </w:r>
+      <w:r>
+        <w:t xml:space="preserve"> </w:t>
+      </w:r>
+      <w:r>
+        <w:t>D</w:t>
+      </w:r>
+      <w:r>
+        <w:t>etail</w:t>
+      </w:r>
+      <w:r>
+        <w:t>s</w:t>
+      </w:r>
+      <w:r>
+        <w:t xml:space="preserve"> use-case </w:t>
+      </w:r>
+      <w:r>
+        <w:t>specification</w:t>
+      </w:r>
+      <w:r>
+        <w:t>s</w:t>
+      </w:r>
+      <w:r>
+        <w:t>,</w:t>
+      </w:r>
+      <w:r>
+        <w:t xml:space="preserve"> functional</w:t>
+      </w:r>
+      <w:r>
+        <w:t xml:space="preserve"> and </w:t>
+      </w:r>
+      <w:r>
+        <w:t>non-functional</w:t>
+      </w:r>
+      <w:r>
+        <w:t xml:space="preserve"> requirements</w:t>
+      </w:r>
+      <w:r>
+        <w:t>, and constraints for the arithmetic parser software</w:t>
+      </w:r>
+      <w:r>
+        <w:t xml:space="preserve"> using natural-language descriptions. </w:t>
+      </w:r>
+    </w:p>
+    <w:p>
+      <w:pPr>
+        <w:pStyle w:val="BodyText"/>
+        <w:numPr>
+          <w:ilvl w:val="0"/>
+          <w:numId w:val="56"/>
+        </w:numPr>
+      </w:pPr>
+      <w:r>
+        <w:rPr>
+          <w:b/>
+          <w:bCs/>
+        </w:rPr>
+        <w:t>Section 4 – Classification of Functional Requirements:</w:t>
+      </w:r>
+      <w:r>
+        <w:t xml:space="preserve"> Presents a table of all functional requirements, categorized by type or order of appearance.</w:t>
+      </w:r>
+    </w:p>
+    <w:p>
+      <w:pPr>
+        <w:pStyle w:val="BodyText"/>
+        <w:numPr>
+          <w:ilvl w:val="0"/>
+          <w:numId w:val="56"/>
+        </w:numPr>
+        <w:rPr>
+          <w:rFonts w:ascii="Arial" w:hAnsi="Arial"/>
+          <w:b/>
+          <w:sz w:val="24"/>
+        </w:rPr>
+      </w:pPr>
+      <w:r>
+        <w:rPr>
+          <w:b/>
+          <w:bCs/>
+        </w:rPr>
+        <w:t>Section 5 – Appendices:</w:t>
+      </w:r>
+      <w:r>
+        <w:rPr>
+          <w:b/>
+          <w:bCs/>
+        </w:rPr>
+        <w:t xml:space="preserve"> </w:t>
+      </w:r>
+      <w:r>
+        <w:t xml:space="preserve">Includes references and </w:t>
+      </w:r>
+      <w:r>
+        <w:t>supporting materials</w:t>
+      </w:r>
+      <w:r>
+        <w:t xml:space="preserve"> </w:t>
+      </w:r>
+      <w:r>
+        <w:t xml:space="preserve">specifying </w:t>
+      </w:r>
+      <w:r>
+        <w:t>which appendices are part of the requirements.</w:t>
+      </w:r>
+      <w:r>
+        <w:rPr>
+          <w:b/>
+          <w:bCs/>
+        </w:rPr>
+        <w:t xml:space="preserve"> </w:t>
       </w:r>
     </w:p>
     <w:p>
@@ -2162,6 +2309,11 @@
     </w:p>
     <w:p>
       <w:pPr>
+        <w:pStyle w:val="BodyText"/>
+      </w:pPr>
+    </w:p>
+    <w:p>
+      <w:pPr>
         <w:pStyle w:val="Heading1"/>
       </w:pPr>
       <w:bookmarkStart w:id="20" w:name="_Toc5537907"/>
@@ -2302,14 +2454,197 @@
     </w:p>
     <w:p>
       <w:pPr>
-        <w:ind w:left="720" w:firstLine="720"/>
-      </w:pPr>
-      <w:r>
-        <w:t>The C++ Arithmetic Expression Evaluator will be implemented using standard C++ and executed through a command-line interface. The system must evaluate arithmetic expressions efficiently and provide clear error messages for invalid input. Development constraints include using standard C++ libraries and ensuring the program compiles and runs in a typical C++ development environment.</w:t>
-      </w:r>
-      <w:r>
-        <w:tab/>
-      </w:r>
+        <w:pStyle w:val="BodyText"/>
+        <w:spacing w:before="120"/>
+      </w:pPr>
+      <w:r>
+        <w:t xml:space="preserve">This section establishes requirements </w:t>
+      </w:r>
+      <w:r>
+        <w:t xml:space="preserve">that create constraints on the functional behavior of the arithmetic expression evaluator. These include </w:t>
+      </w:r>
+      <w:r>
+        <w:t>non-functional requirements and development constraints.</w:t>
+      </w:r>
+    </w:p>
+    <w:p>
+      <w:pPr>
+        <w:pStyle w:val="Heading3"/>
+      </w:pPr>
+      <w:r>
+        <w:t>Usability</w:t>
+      </w:r>
+    </w:p>
+    <w:p>
+      <w:pPr>
+        <w:spacing w:before="120"/>
+        <w:ind w:left="720"/>
+      </w:pPr>
+      <w:r>
+        <w:t xml:space="preserve">The program must provide a command-line interface that clearly prompts the user to enter an arithmetic expression. After evaluation, the program must display the result in a legible format that clearly highlights the input expression and the calculated output. All prompts and outputs must follow a consistent format using clear and unambiguous language. </w:t>
+      </w:r>
+    </w:p>
+    <w:p>
+      <w:pPr>
+        <w:pStyle w:val="Heading3"/>
+      </w:pPr>
+      <w:r>
+        <w:t>Performance</w:t>
+      </w:r>
+    </w:p>
+    <w:p>
+      <w:pPr>
+        <w:spacing w:before="120"/>
+        <w:ind w:left="720"/>
+      </w:pPr>
+      <w:r>
+        <w:t xml:space="preserve">The </w:t>
+      </w:r>
+      <w:r>
+        <w:t>parser must evaluate expressions efficiently</w:t>
+      </w:r>
+      <w:r>
+        <w:t xml:space="preserve"> without a noticeable delay in the time to evaluate. </w:t>
+      </w:r>
+      <w:r>
+        <w:t>In addition, t</w:t>
+      </w:r>
+      <w:r>
+        <w:t xml:space="preserve">he software should </w:t>
+      </w:r>
+      <w:r>
+        <w:t xml:space="preserve">allow consecutive calculations without a restart. </w:t>
+      </w:r>
+    </w:p>
+    <w:p>
+      <w:pPr>
+        <w:pStyle w:val="Heading3"/>
+      </w:pPr>
+      <w:r>
+        <w:t>Reliability</w:t>
+      </w:r>
+    </w:p>
+    <w:p>
+      <w:pPr>
+        <w:pStyle w:val="BodyText"/>
+        <w:spacing w:before="120"/>
+      </w:pPr>
+      <w:r>
+        <w:t>The parser must handle</w:t>
+      </w:r>
+      <w:r>
+        <w:t xml:space="preserve"> errors, including</w:t>
+      </w:r>
+      <w:r>
+        <w:t xml:space="preserve"> invalid expressions</w:t>
+      </w:r>
+      <w:r>
+        <w:t xml:space="preserve"> or </w:t>
+      </w:r>
+      <w:r>
+        <w:t>division by zero</w:t>
+      </w:r>
+      <w:r>
+        <w:t xml:space="preserve">, </w:t>
+      </w:r>
+      <w:r>
+        <w:t xml:space="preserve">that display the error in a user-friendly way. </w:t>
+      </w:r>
+      <w:r>
+        <w:t>All solutions must be accurate and clearly inform the user of the intended result.</w:t>
+      </w:r>
+    </w:p>
+    <w:p>
+      <w:pPr>
+        <w:pStyle w:val="Heading3"/>
+      </w:pPr>
+      <w:r>
+        <w:t>Portability</w:t>
+      </w:r>
+    </w:p>
+    <w:p>
+      <w:pPr>
+        <w:pStyle w:val="BodyText"/>
+        <w:spacing w:before="120"/>
+      </w:pPr>
+      <w:r>
+        <w:t xml:space="preserve">The parser must compile and run on different platforms or environments, such as Windows, Linux, and macOS. </w:t>
+      </w:r>
+      <w:r>
+        <w:t>Users across all platforms must experience consistent performance</w:t>
+      </w:r>
+      <w:r>
+        <w:t xml:space="preserve"> that displays the proper functionality.</w:t>
+      </w:r>
+    </w:p>
+    <w:p>
+      <w:pPr>
+        <w:pStyle w:val="Heading3"/>
+      </w:pPr>
+      <w:r>
+        <w:t>Constraints</w:t>
+      </w:r>
+    </w:p>
+    <w:p>
+      <w:pPr>
+        <w:spacing w:before="120"/>
+        <w:ind w:left="720"/>
+      </w:pPr>
+      <w:r>
+        <w:t xml:space="preserve">The </w:t>
+      </w:r>
+      <w:r>
+        <w:t>programming</w:t>
+      </w:r>
+      <w:r>
+        <w:t xml:space="preserve"> must be developed using C++</w:t>
+      </w:r>
+      <w:r>
+        <w:t xml:space="preserve">. </w:t>
+      </w:r>
+      <w:r>
+        <w:t xml:space="preserve">The standard libraries of C++ can be used to </w:t>
+      </w:r>
+      <w:r>
+        <w:t>ensure reliability and usability for the user. Also, t</w:t>
+      </w:r>
+      <w:r>
+        <w:t>he only operators that will be supported are +, -, *</w:t>
+      </w:r>
+      <w:r>
+        <w:t>, /, %, and **</w:t>
+      </w:r>
+      <w:r>
+        <w:t xml:space="preserve">, which must use PEMDAS rules </w:t>
+      </w:r>
+      <w:r>
+        <w:t xml:space="preserve">to evaluate. </w:t>
+      </w:r>
+      <w:r>
+        <w:t xml:space="preserve">Initially, the </w:t>
+      </w:r>
+      <w:r>
+        <w:t>input</w:t>
+      </w:r>
+      <w:r>
+        <w:t xml:space="preserve"> must be integers</w:t>
+      </w:r>
+      <w:r>
+        <w:t xml:space="preserve"> to be evaluated in the expression, but later, floating point input may be available. </w:t>
+      </w:r>
+      <w:r>
+        <w:t>Finally, the command-line interface must be used for the user and system to interact.</w:t>
+      </w:r>
+    </w:p>
+    <w:p>
+      <w:pPr>
+        <w:ind w:left="720"/>
+      </w:pPr>
+    </w:p>
+    <w:p>
+      <w:pPr>
+        <w:ind w:left="720"/>
+      </w:pPr>
     </w:p>
     <w:p>
       <w:pPr>
@@ -2456,6 +2791,7 @@
               <w:spacing w:before="120" w:after="120"/>
             </w:pPr>
             <w:r>
+              <w:lastRenderedPageBreak/>
               <w:t>...</w:t>
             </w:r>
           </w:p>
@@ -2516,7 +2852,13 @@
     </w:tbl>
     <w:p>
       <w:pPr>
-        <w:pStyle w:val="InfoBlue"/>
+        <w:pStyle w:val="BodyText"/>
+        <w:ind w:left="0"/>
+      </w:pPr>
+    </w:p>
+    <w:p>
+      <w:pPr>
+        <w:pStyle w:val="BodyText"/>
       </w:pPr>
     </w:p>
     <w:p>
@@ -2704,13 +3046,11 @@
           <w:r>
             <w:sym w:font="Symbol" w:char="F0D3"/>
           </w:r>
-          <w:fldSimple w:instr=" DOCPROPERTY &quot;Company&quot;  \* MERGEFORMAT ">
-            <w:r>
-              <w:t>&lt;Company Name&gt;</w:t>
-            </w:r>
-          </w:fldSimple>
           <w:r>
-            <w:t xml:space="preserve">, </w:t>
+            <w:t xml:space="preserve"> University of Kansas</w:t>
+          </w:r>
+          <w:r>
+            <w:t xml:space="preserve"> </w:t>
           </w:r>
           <w:r>
             <w:fldChar w:fldCharType="begin"/>
@@ -2864,55 +3204,7 @@
         <w:b/>
         <w:sz w:val="36"/>
       </w:rPr>
-      <w:fldChar w:fldCharType="begin"/>
-    </w:r>
-    <w:r>
-      <w:rPr>
-        <w:rFonts w:ascii="Arial" w:hAnsi="Arial"/>
-        <w:b/>
-        <w:sz w:val="36"/>
-      </w:rPr>
-      <w:instrText xml:space="preserve"> DOCPROPERTY "Company"  \* MERGEFORMAT </w:instrText>
-    </w:r>
-    <w:r>
-      <w:rPr>
-        <w:rFonts w:ascii="Arial" w:hAnsi="Arial"/>
-        <w:b/>
-        <w:sz w:val="36"/>
-      </w:rPr>
-      <w:fldChar w:fldCharType="separate"/>
-    </w:r>
-    <w:r>
-      <w:rPr>
-        <w:rFonts w:ascii="Arial" w:hAnsi="Arial"/>
-        <w:b/>
-        <w:sz w:val="36"/>
-      </w:rPr>
-      <w:t>&lt;</w:t>
-    </w:r>
-    <w:r>
-      <w:rPr>
-        <w:rFonts w:ascii="Arial" w:hAnsi="Arial"/>
-        <w:b/>
-        <w:sz w:val="36"/>
-      </w:rPr>
       <w:t>University of Kansas</w:t>
-    </w:r>
-    <w:r>
-      <w:rPr>
-        <w:rFonts w:ascii="Arial" w:hAnsi="Arial"/>
-        <w:b/>
-        <w:sz w:val="36"/>
-      </w:rPr>
-      <w:t>&gt;</w:t>
-    </w:r>
-    <w:r>
-      <w:rPr>
-        <w:rFonts w:ascii="Arial" w:hAnsi="Arial"/>
-        <w:b/>
-        <w:sz w:val="36"/>
-      </w:rPr>
-      <w:fldChar w:fldCharType="end"/>
     </w:r>
   </w:p>
   <w:p>
@@ -2978,7 +3270,16 @@
             <w:ind w:right="68"/>
           </w:pPr>
           <w:r>
-            <w:t xml:space="preserve">  Version:           1.0</w:t>
+            <w:t xml:space="preserve">  Version:           </w:t>
+          </w:r>
+          <w:r>
+            <w:rPr>
+              <w:highlight w:val="green"/>
+            </w:rPr>
+            <w:t>1.</w:t>
+          </w:r>
+          <w:r>
+            <w:t>1</w:t>
           </w:r>
         </w:p>
       </w:tc>
@@ -3002,13 +3303,10 @@
         </w:tcPr>
         <w:p>
           <w:r>
-            <w:t xml:space="preserve">  Date:  &lt;</w:t>
+            <w:t xml:space="preserve">  Date:  </w:t>
           </w:r>
           <w:r>
-            <w:t>3/10/2026</w:t>
-          </w:r>
-          <w:r>
-            <w:t>&gt;</w:t>
+            <w:t>07/Mar/26</w:t>
           </w:r>
         </w:p>
       </w:tc>
@@ -3021,7 +3319,16 @@
         </w:tcPr>
         <w:p>
           <w:r>
-            <w:t>EECS348-SRS-TermProj-1.0</w:t>
+            <w:t>EECS348-SRS-TermProj-</w:t>
+          </w:r>
+          <w:r>
+            <w:rPr>
+              <w:highlight w:val="green"/>
+            </w:rPr>
+            <w:t>v1.</w:t>
+          </w:r>
+          <w:r>
+            <w:t>1</w:t>
           </w:r>
         </w:p>
       </w:tc>
@@ -4025,6 +4332,119 @@
     </w:lvl>
   </w:abstractNum>
   <w:abstractNum w:abstractNumId="19" w15:restartNumberingAfterBreak="0">
+    <w:nsid w:val="51AD2E9A"/>
+    <w:multiLevelType w:val="hybridMultilevel"/>
+    <w:tmpl w:val="2110B5C8"/>
+    <w:lvl w:ilvl="0" w:tplc="04090001">
+      <w:start w:val="1"/>
+      <w:numFmt w:val="bullet"/>
+      <w:lvlText w:val=""/>
+      <w:lvlJc w:val="left"/>
+      <w:pPr>
+        <w:ind w:left="1440" w:hanging="360"/>
+      </w:pPr>
+      <w:rPr>
+        <w:rFonts w:ascii="Symbol" w:hAnsi="Symbol" w:hint="default"/>
+      </w:rPr>
+    </w:lvl>
+    <w:lvl w:ilvl="1" w:tplc="04090003" w:tentative="1">
+      <w:start w:val="1"/>
+      <w:numFmt w:val="bullet"/>
+      <w:lvlText w:val="o"/>
+      <w:lvlJc w:val="left"/>
+      <w:pPr>
+        <w:ind w:left="2160" w:hanging="360"/>
+      </w:pPr>
+      <w:rPr>
+        <w:rFonts w:ascii="Courier New" w:hAnsi="Courier New" w:cs="Courier New" w:hint="default"/>
+      </w:rPr>
+    </w:lvl>
+    <w:lvl w:ilvl="2" w:tplc="04090005" w:tentative="1">
+      <w:start w:val="1"/>
+      <w:numFmt w:val="bullet"/>
+      <w:lvlText w:val=""/>
+      <w:lvlJc w:val="left"/>
+      <w:pPr>
+        <w:ind w:left="2880" w:hanging="360"/>
+      </w:pPr>
+      <w:rPr>
+        <w:rFonts w:ascii="Wingdings" w:hAnsi="Wingdings" w:hint="default"/>
+      </w:rPr>
+    </w:lvl>
+    <w:lvl w:ilvl="3" w:tplc="04090001" w:tentative="1">
+      <w:start w:val="1"/>
+      <w:numFmt w:val="bullet"/>
+      <w:lvlText w:val=""/>
+      <w:lvlJc w:val="left"/>
+      <w:pPr>
+        <w:ind w:left="3600" w:hanging="360"/>
+      </w:pPr>
+      <w:rPr>
+        <w:rFonts w:ascii="Symbol" w:hAnsi="Symbol" w:hint="default"/>
+      </w:rPr>
+    </w:lvl>
+    <w:lvl w:ilvl="4" w:tplc="04090003" w:tentative="1">
+      <w:start w:val="1"/>
+      <w:numFmt w:val="bullet"/>
+      <w:lvlText w:val="o"/>
+      <w:lvlJc w:val="left"/>
+      <w:pPr>
+        <w:ind w:left="4320" w:hanging="360"/>
+      </w:pPr>
+      <w:rPr>
+        <w:rFonts w:ascii="Courier New" w:hAnsi="Courier New" w:cs="Courier New" w:hint="default"/>
+      </w:rPr>
+    </w:lvl>
+    <w:lvl w:ilvl="5" w:tplc="04090005" w:tentative="1">
+      <w:start w:val="1"/>
+      <w:numFmt w:val="bullet"/>
+      <w:lvlText w:val=""/>
+      <w:lvlJc w:val="left"/>
+      <w:pPr>
+        <w:ind w:left="5040" w:hanging="360"/>
+      </w:pPr>
+      <w:rPr>
+        <w:rFonts w:ascii="Wingdings" w:hAnsi="Wingdings" w:hint="default"/>
+      </w:rPr>
+    </w:lvl>
+    <w:lvl w:ilvl="6" w:tplc="04090001" w:tentative="1">
+      <w:start w:val="1"/>
+      <w:numFmt w:val="bullet"/>
+      <w:lvlText w:val=""/>
+      <w:lvlJc w:val="left"/>
+      <w:pPr>
+        <w:ind w:left="5760" w:hanging="360"/>
+      </w:pPr>
+      <w:rPr>
+        <w:rFonts w:ascii="Symbol" w:hAnsi="Symbol" w:hint="default"/>
+      </w:rPr>
+    </w:lvl>
+    <w:lvl w:ilvl="7" w:tplc="04090003" w:tentative="1">
+      <w:start w:val="1"/>
+      <w:numFmt w:val="bullet"/>
+      <w:lvlText w:val="o"/>
+      <w:lvlJc w:val="left"/>
+      <w:pPr>
+        <w:ind w:left="6480" w:hanging="360"/>
+      </w:pPr>
+      <w:rPr>
+        <w:rFonts w:ascii="Courier New" w:hAnsi="Courier New" w:cs="Courier New" w:hint="default"/>
+      </w:rPr>
+    </w:lvl>
+    <w:lvl w:ilvl="8" w:tplc="04090005" w:tentative="1">
+      <w:start w:val="1"/>
+      <w:numFmt w:val="bullet"/>
+      <w:lvlText w:val=""/>
+      <w:lvlJc w:val="left"/>
+      <w:pPr>
+        <w:ind w:left="7200" w:hanging="360"/>
+      </w:pPr>
+      <w:rPr>
+        <w:rFonts w:ascii="Wingdings" w:hAnsi="Wingdings" w:hint="default"/>
+      </w:rPr>
+    </w:lvl>
+  </w:abstractNum>
+  <w:abstractNum w:abstractNumId="20" w15:restartNumberingAfterBreak="0">
     <w:nsid w:val="52DF734E"/>
     <w:multiLevelType w:val="singleLevel"/>
     <w:tmpl w:val="04090001"/>
@@ -4044,7 +4464,7 @@
       </w:rPr>
     </w:lvl>
   </w:abstractNum>
-  <w:abstractNum w:abstractNumId="20" w15:restartNumberingAfterBreak="0">
+  <w:abstractNum w:abstractNumId="21" w15:restartNumberingAfterBreak="0">
     <w:nsid w:val="606962A1"/>
     <w:multiLevelType w:val="hybridMultilevel"/>
     <w:tmpl w:val="EB34D1CC"/>
@@ -4184,7 +4604,7 @@
       </w:rPr>
     </w:lvl>
   </w:abstractNum>
-  <w:abstractNum w:abstractNumId="21" w15:restartNumberingAfterBreak="0">
+  <w:abstractNum w:abstractNumId="22" w15:restartNumberingAfterBreak="0">
     <w:nsid w:val="66807FD9"/>
     <w:multiLevelType w:val="hybridMultilevel"/>
     <w:tmpl w:val="EDA6B834"/>
@@ -4324,7 +4744,7 @@
       </w:rPr>
     </w:lvl>
   </w:abstractNum>
-  <w:abstractNum w:abstractNumId="22" w15:restartNumberingAfterBreak="0">
+  <w:abstractNum w:abstractNumId="23" w15:restartNumberingAfterBreak="0">
     <w:nsid w:val="6D2F7D46"/>
     <w:multiLevelType w:val="singleLevel"/>
     <w:tmpl w:val="04090001"/>
@@ -4344,7 +4764,7 @@
       </w:rPr>
     </w:lvl>
   </w:abstractNum>
-  <w:abstractNum w:abstractNumId="23" w15:restartNumberingAfterBreak="0">
+  <w:abstractNum w:abstractNumId="24" w15:restartNumberingAfterBreak="0">
     <w:nsid w:val="6D8859E9"/>
     <w:multiLevelType w:val="hybridMultilevel"/>
     <w:tmpl w:val="68C4A246"/>
@@ -4484,7 +4904,7 @@
       </w:rPr>
     </w:lvl>
   </w:abstractNum>
-  <w:abstractNum w:abstractNumId="24" w15:restartNumberingAfterBreak="0">
+  <w:abstractNum w:abstractNumId="25" w15:restartNumberingAfterBreak="0">
     <w:nsid w:val="71F21F2A"/>
     <w:multiLevelType w:val="singleLevel"/>
     <w:tmpl w:val="04090001"/>
@@ -4504,7 +4924,7 @@
       </w:rPr>
     </w:lvl>
   </w:abstractNum>
-  <w:abstractNum w:abstractNumId="25" w15:restartNumberingAfterBreak="0">
+  <w:abstractNum w:abstractNumId="26" w15:restartNumberingAfterBreak="0">
     <w:nsid w:val="743601FB"/>
     <w:multiLevelType w:val="singleLevel"/>
     <w:tmpl w:val="04090001"/>
@@ -4524,7 +4944,7 @@
       </w:rPr>
     </w:lvl>
   </w:abstractNum>
-  <w:abstractNum w:abstractNumId="26" w15:restartNumberingAfterBreak="0">
+  <w:abstractNum w:abstractNumId="27" w15:restartNumberingAfterBreak="0">
     <w:nsid w:val="756150CA"/>
     <w:multiLevelType w:val="singleLevel"/>
     <w:tmpl w:val="04090001"/>
@@ -4544,7 +4964,7 @@
       </w:rPr>
     </w:lvl>
   </w:abstractNum>
-  <w:abstractNum w:abstractNumId="27" w15:restartNumberingAfterBreak="0">
+  <w:abstractNum w:abstractNumId="28" w15:restartNumberingAfterBreak="0">
     <w:nsid w:val="7BE434D7"/>
     <w:multiLevelType w:val="singleLevel"/>
     <w:tmpl w:val="04090001"/>
@@ -4564,7 +4984,7 @@
       </w:rPr>
     </w:lvl>
   </w:abstractNum>
-  <w:abstractNum w:abstractNumId="28" w15:restartNumberingAfterBreak="0">
+  <w:abstractNum w:abstractNumId="29" w15:restartNumberingAfterBreak="0">
     <w:nsid w:val="7C285540"/>
     <w:multiLevelType w:val="hybridMultilevel"/>
     <w:tmpl w:val="70C83E90"/>
@@ -4711,10 +5131,10 @@
     <w:abstractNumId w:val="12"/>
   </w:num>
   <w:num w:numId="3" w16cid:durableId="133063116">
-    <w:abstractNumId w:val="27"/>
+    <w:abstractNumId w:val="28"/>
   </w:num>
   <w:num w:numId="4" w16cid:durableId="614676279">
-    <w:abstractNumId w:val="19"/>
+    <w:abstractNumId w:val="20"/>
   </w:num>
   <w:num w:numId="5" w16cid:durableId="2134051340">
     <w:abstractNumId w:val="18"/>
@@ -4740,7 +5160,7 @@
     <w:abstractNumId w:val="2"/>
   </w:num>
   <w:num w:numId="8" w16cid:durableId="1658069430">
-    <w:abstractNumId w:val="26"/>
+    <w:abstractNumId w:val="27"/>
   </w:num>
   <w:num w:numId="9" w16cid:durableId="1894076237">
     <w:abstractNumId w:val="4"/>
@@ -4752,7 +5172,7 @@
     <w:abstractNumId w:val="11"/>
   </w:num>
   <w:num w:numId="12" w16cid:durableId="1162895873">
-    <w:abstractNumId w:val="25"/>
+    <w:abstractNumId w:val="26"/>
   </w:num>
   <w:num w:numId="13" w16cid:durableId="324743573">
     <w:abstractNumId w:val="10"/>
@@ -4761,7 +5181,7 @@
     <w:abstractNumId w:val="5"/>
   </w:num>
   <w:num w:numId="15" w16cid:durableId="732969655">
-    <w:abstractNumId w:val="24"/>
+    <w:abstractNumId w:val="25"/>
   </w:num>
   <w:num w:numId="16" w16cid:durableId="925263170">
     <w:abstractNumId w:val="17"/>
@@ -4794,7 +5214,7 @@
     <w:abstractNumId w:val="9"/>
   </w:num>
   <w:num w:numId="21" w16cid:durableId="1506090820">
-    <w:abstractNumId w:val="22"/>
+    <w:abstractNumId w:val="23"/>
   </w:num>
   <w:num w:numId="22" w16cid:durableId="527568217">
     <w:abstractNumId w:val="0"/>
@@ -4899,22 +5319,22 @@
     <w:abstractNumId w:val="0"/>
   </w:num>
   <w:num w:numId="47" w16cid:durableId="1923221520">
-    <w:abstractNumId w:val="21"/>
+    <w:abstractNumId w:val="22"/>
   </w:num>
   <w:num w:numId="48" w16cid:durableId="1943223494">
     <w:abstractNumId w:val="6"/>
   </w:num>
   <w:num w:numId="49" w16cid:durableId="812253944">
-    <w:abstractNumId w:val="23"/>
+    <w:abstractNumId w:val="24"/>
   </w:num>
   <w:num w:numId="50" w16cid:durableId="484250662">
-    <w:abstractNumId w:val="20"/>
+    <w:abstractNumId w:val="21"/>
   </w:num>
   <w:num w:numId="51" w16cid:durableId="530145825">
     <w:abstractNumId w:val="15"/>
   </w:num>
   <w:num w:numId="52" w16cid:durableId="1504007009">
-    <w:abstractNumId w:val="28"/>
+    <w:abstractNumId w:val="29"/>
   </w:num>
   <w:num w:numId="53" w16cid:durableId="1814255496">
     <w:abstractNumId w:val="14"/>
@@ -4924,6 +5344,9 @@
   </w:num>
   <w:num w:numId="55" w16cid:durableId="154028298">
     <w:abstractNumId w:val="8"/>
+  </w:num>
+  <w:num w:numId="56" w16cid:durableId="1332106397">
+    <w:abstractNumId w:val="19"/>
   </w:num>
 </w:numbering>
 </file>
@@ -5480,6 +5903,7 @@
   <w:style w:type="character" w:default="1" w:styleId="DefaultParagraphFont">
     <w:name w:val="Default Paragraph Font"/>
     <w:uiPriority w:val="1"/>
+    <w:semiHidden/>
     <w:unhideWhenUsed/>
   </w:style>
   <w:style w:type="table" w:default="1" w:styleId="TableNormal">
@@ -5861,7 +6285,6 @@
   </w:style>
   <w:style w:type="character" w:styleId="Strong">
     <w:name w:val="Strong"/>
-    <w:uiPriority w:val="22"/>
     <w:qFormat/>
     <w:rPr>
       <w:b/>

</xml_diff>

<commit_message>
Updated 1.3 and 3.3
</commit_message>
<xml_diff>
--- a/documentation/02-Software-Requirements-Spec.docx
+++ b/documentation/02-Software-Requirements-Spec.docx
@@ -1863,32 +1863,79 @@
         <w:t xml:space="preserve">This Software Requirements Specification (SRS) describes the requirements for a </w:t>
       </w:r>
       <w:r>
+        <w:t>C++ Arithmetic Expression Evaluator</w:t>
+      </w:r>
+      <w:r>
+        <w:t>. The application allows users to input arithmetic expressions containing numbers, operators (+, −, *, /</w:t>
+      </w:r>
+      <w:r>
+        <w:t>, %</w:t>
+      </w:r>
+      <w:r>
+        <w:t>, **</w:t>
+      </w:r>
+      <w:r>
+        <w:t xml:space="preserve">), and parentheses, and </w:t>
+      </w:r>
+      <w:proofErr w:type="gramStart"/>
+      <w:r>
+        <w:t>computes</w:t>
+      </w:r>
+      <w:proofErr w:type="gramEnd"/>
+      <w:r>
+        <w:t xml:space="preserve"> the correct result according to standard order of operations. The system will process user input, evaluate the expression, and display the calculated output through </w:t>
+      </w:r>
+      <w:r>
+        <w:t>the command line.</w:t>
+      </w:r>
+      <w:r>
+        <w:t xml:space="preserve"> This document defines the functional behavior of the system, including expression parsing, evaluation, and basic error handling for invalid input. </w:t>
+      </w:r>
+    </w:p>
+    <w:p>
+      <w:pPr>
+        <w:pStyle w:val="Heading2"/>
+      </w:pPr>
+      <w:bookmarkStart w:id="3" w:name="_Toc5537890"/>
+      <w:r>
+        <w:t>Definitions, Acronyms, and Abbreviations</w:t>
+      </w:r>
+      <w:bookmarkEnd w:id="3"/>
+    </w:p>
+    <w:p>
+      <w:pPr>
+        <w:pStyle w:val="InfoBlue"/>
+      </w:pPr>
+      <w:r>
+        <w:t xml:space="preserve">[This subsection provides the definitions of all terms, acronyms, and abbreviations required to properly interpret the </w:t>
+      </w:r>
+      <w:r>
         <w:rPr>
           <w:b/>
           <w:bCs/>
         </w:rPr>
-        <w:t>C++ Arithmetic Expression Evaluator</w:t>
-      </w:r>
-      <w:r>
-        <w:t>. The application allows users to input arithmetic expressions containing numbers, operators (+, −, *, /), and parentheses, and computes the correct result according to standard order of operations. The system will process user input, evaluate the expression, and display the calculated output through a command-line interface. This document defines the functional behavior of the system, including expression parsing, evaluation, and basic error handling for invalid input. The system is limited to evaluating basic arithmetic expressions and does not include advanced mathematical functions or graphical interfaces.</w:t>
+        <w:t>SRS</w:t>
+      </w:r>
+      <w:r>
+        <w:t>.  This information may be provided by reference to the project’s Glossary.]</w:t>
       </w:r>
     </w:p>
     <w:p>
       <w:pPr>
         <w:pStyle w:val="Heading2"/>
       </w:pPr>
-      <w:bookmarkStart w:id="3" w:name="_Toc5537890"/>
-      <w:r>
-        <w:t>Definitions, Acronyms, and Abbreviations</w:t>
-      </w:r>
-      <w:bookmarkEnd w:id="3"/>
+      <w:bookmarkStart w:id="4" w:name="_Toc5537891"/>
+      <w:r>
+        <w:t>References</w:t>
+      </w:r>
+      <w:bookmarkEnd w:id="4"/>
     </w:p>
     <w:p>
       <w:pPr>
         <w:pStyle w:val="InfoBlue"/>
       </w:pPr>
       <w:r>
-        <w:t xml:space="preserve">[This subsection provides the definitions of all terms, acronyms, and abbreviations required to properly interpret the </w:t>
+        <w:t xml:space="preserve">[This subsection provides a complete list of all documents referenced elsewhere in the </w:t>
       </w:r>
       <w:r>
         <w:rPr>
@@ -1898,25 +1945,25 @@
         <w:t>SRS</w:t>
       </w:r>
       <w:r>
-        <w:t>.  This information may be provided by reference to the project’s Glossary.]</w:t>
+        <w:t>.  Identify each document by title, report number if applicable, date, and publishing organization.  Specify the sources from which the references can be obtained. This information may be provided by reference to an appendix or to another document.]</w:t>
       </w:r>
     </w:p>
     <w:p>
       <w:pPr>
         <w:pStyle w:val="Heading2"/>
       </w:pPr>
-      <w:bookmarkStart w:id="4" w:name="_Toc5537891"/>
-      <w:r>
-        <w:t>References</w:t>
-      </w:r>
-      <w:bookmarkEnd w:id="4"/>
+      <w:bookmarkStart w:id="5" w:name="_Toc5537892"/>
+      <w:r>
+        <w:t>Overview</w:t>
+      </w:r>
+      <w:bookmarkEnd w:id="5"/>
     </w:p>
     <w:p>
       <w:pPr>
         <w:pStyle w:val="InfoBlue"/>
       </w:pPr>
       <w:r>
-        <w:t xml:space="preserve">[This subsection provides a complete list of all documents referenced elsewhere in the </w:t>
+        <w:t xml:space="preserve">[This subsection describes what the rest of the </w:t>
       </w:r>
       <w:r>
         <w:rPr>
@@ -1926,25 +1973,29 @@
         <w:t>SRS</w:t>
       </w:r>
       <w:r>
-        <w:t>.  Identify each document by title, report number if applicable, date, and publishing organization.  Specify the sources from which the references can be obtained. This information may be provided by reference to an appendix or to another document.]</w:t>
-      </w:r>
-    </w:p>
-    <w:p>
-      <w:pPr>
-        <w:pStyle w:val="Heading2"/>
-      </w:pPr>
-      <w:bookmarkStart w:id="5" w:name="_Toc5537892"/>
-      <w:r>
-        <w:t>Overview</w:t>
-      </w:r>
-      <w:bookmarkEnd w:id="5"/>
+        <w:t xml:space="preserve"> contains and explains how the document is organized.]</w:t>
+      </w:r>
+    </w:p>
+    <w:p>
+      <w:pPr>
+        <w:pStyle w:val="Heading1"/>
+      </w:pPr>
+      <w:r>
+        <w:br w:type="page"/>
+      </w:r>
+      <w:bookmarkStart w:id="6" w:name="_Toc5537893"/>
+      <w:r>
+        <w:lastRenderedPageBreak/>
+        <w:t>Overall Description</w:t>
+      </w:r>
+      <w:bookmarkEnd w:id="6"/>
     </w:p>
     <w:p>
       <w:pPr>
         <w:pStyle w:val="InfoBlue"/>
       </w:pPr>
       <w:r>
-        <w:t xml:space="preserve">[This subsection describes what the rest of the </w:t>
+        <w:t xml:space="preserve">[This section of the </w:t>
       </w:r>
       <w:r>
         <w:rPr>
@@ -1954,22 +2005,192 @@
         <w:t>SRS</w:t>
       </w:r>
       <w:r>
-        <w:t xml:space="preserve"> contains and explains how the document is organized.]</w:t>
-      </w:r>
+        <w:t xml:space="preserve"> describes the general factors that affect the product and its requirements.  This section does not state specific requirements.  Instead, it provides a background for those requirements, which are defined in detail in Section 3, and makes them easier to understand. Include such items as: </w:t>
+      </w:r>
+    </w:p>
+    <w:p>
+      <w:pPr>
+        <w:pStyle w:val="Heading2"/>
+      </w:pPr>
+      <w:bookmarkStart w:id="7" w:name="_Toc5537894"/>
+      <w:r>
+        <w:t>Product perspective</w:t>
+      </w:r>
+      <w:bookmarkEnd w:id="7"/>
+    </w:p>
+    <w:p>
+      <w:pPr>
+        <w:pStyle w:val="Heading3"/>
+        <w:rPr>
+          <w:highlight w:val="yellow"/>
+        </w:rPr>
+      </w:pPr>
+      <w:bookmarkStart w:id="8" w:name="_Toc5537895"/>
+      <w:r>
+        <w:rPr>
+          <w:highlight w:val="yellow"/>
+        </w:rPr>
+        <w:t xml:space="preserve">System </w:t>
+      </w:r>
+      <w:bookmarkEnd w:id="8"/>
+      <w:r>
+        <w:rPr>
+          <w:highlight w:val="yellow"/>
+        </w:rPr>
+        <w:t>Interfaces</w:t>
+      </w:r>
+    </w:p>
+    <w:p>
+      <w:pPr>
+        <w:pStyle w:val="Heading3"/>
+      </w:pPr>
+      <w:bookmarkStart w:id="9" w:name="_Toc5537896"/>
+      <w:r>
+        <w:t>User Interfaces</w:t>
+      </w:r>
+      <w:bookmarkEnd w:id="9"/>
+    </w:p>
+    <w:p>
+      <w:pPr>
+        <w:pStyle w:val="Heading3"/>
+        <w:rPr>
+          <w:highlight w:val="yellow"/>
+        </w:rPr>
+      </w:pPr>
+      <w:bookmarkStart w:id="10" w:name="_Toc5537897"/>
+      <w:r>
+        <w:rPr>
+          <w:highlight w:val="yellow"/>
+        </w:rPr>
+        <w:t>Hardware Interfaces</w:t>
+      </w:r>
+      <w:bookmarkEnd w:id="10"/>
+    </w:p>
+    <w:p>
+      <w:pPr>
+        <w:pStyle w:val="Heading3"/>
+      </w:pPr>
+      <w:bookmarkStart w:id="11" w:name="_Toc5537898"/>
+      <w:r>
+        <w:t>Software Interfaces</w:t>
+      </w:r>
+      <w:bookmarkEnd w:id="11"/>
+    </w:p>
+    <w:p>
+      <w:pPr>
+        <w:pStyle w:val="Heading3"/>
+        <w:rPr>
+          <w:highlight w:val="yellow"/>
+        </w:rPr>
+      </w:pPr>
+      <w:bookmarkStart w:id="12" w:name="_Toc5537899"/>
+      <w:r>
+        <w:rPr>
+          <w:highlight w:val="yellow"/>
+        </w:rPr>
+        <w:t>Communication Interfaces</w:t>
+      </w:r>
+      <w:bookmarkEnd w:id="12"/>
+    </w:p>
+    <w:p>
+      <w:pPr>
+        <w:pStyle w:val="Heading3"/>
+      </w:pPr>
+      <w:bookmarkStart w:id="13" w:name="_Toc5537900"/>
+      <w:r>
+        <w:t>Memory Constraints</w:t>
+      </w:r>
+      <w:bookmarkEnd w:id="13"/>
+    </w:p>
+    <w:p>
+      <w:pPr>
+        <w:pStyle w:val="Heading3"/>
+        <w:rPr>
+          <w:highlight w:val="yellow"/>
+        </w:rPr>
+      </w:pPr>
+      <w:bookmarkStart w:id="14" w:name="_Toc5537901"/>
+      <w:r>
+        <w:rPr>
+          <w:highlight w:val="yellow"/>
+        </w:rPr>
+        <w:t>Operations</w:t>
+      </w:r>
+      <w:bookmarkEnd w:id="14"/>
+    </w:p>
+    <w:p>
+      <w:pPr>
+        <w:pStyle w:val="Heading2"/>
+      </w:pPr>
+      <w:bookmarkStart w:id="15" w:name="_Toc5537902"/>
+      <w:r>
+        <w:t>Product functions</w:t>
+      </w:r>
+      <w:bookmarkEnd w:id="15"/>
+    </w:p>
+    <w:p>
+      <w:pPr>
+        <w:pStyle w:val="Heading2"/>
+      </w:pPr>
+      <w:bookmarkStart w:id="16" w:name="_Toc5537903"/>
+      <w:r>
+        <w:t>User characteristics</w:t>
+      </w:r>
+      <w:bookmarkEnd w:id="16"/>
+    </w:p>
+    <w:p>
+      <w:pPr>
+        <w:pStyle w:val="Heading2"/>
+      </w:pPr>
+      <w:bookmarkStart w:id="17" w:name="_Toc5537904"/>
+      <w:r>
+        <w:t>Constraints</w:t>
+      </w:r>
+      <w:bookmarkEnd w:id="17"/>
+    </w:p>
+    <w:p>
+      <w:pPr>
+        <w:pStyle w:val="Heading2"/>
+      </w:pPr>
+      <w:bookmarkStart w:id="18" w:name="_Toc5537905"/>
+      <w:r>
+        <w:t>Assumptions and dependencies</w:t>
+      </w:r>
+      <w:bookmarkEnd w:id="18"/>
+    </w:p>
+    <w:p>
+      <w:pPr>
+        <w:pStyle w:val="Heading2"/>
+        <w:rPr>
+          <w:highlight w:val="yellow"/>
+        </w:rPr>
+      </w:pPr>
+      <w:bookmarkStart w:id="19" w:name="_Toc5537906"/>
+      <w:r>
+        <w:rPr>
+          <w:highlight w:val="yellow"/>
+        </w:rPr>
+        <w:t>Requirements subsets</w:t>
+      </w:r>
+      <w:bookmarkEnd w:id="19"/>
+    </w:p>
+    <w:p>
+      <w:pPr>
+        <w:pStyle w:val="BodyText"/>
+      </w:pPr>
     </w:p>
     <w:p>
       <w:pPr>
         <w:pStyle w:val="Heading1"/>
       </w:pPr>
-      <w:r>
-        <w:br w:type="page"/>
-      </w:r>
-      <w:bookmarkStart w:id="6" w:name="_Toc5537893"/>
-      <w:r>
-        <w:lastRenderedPageBreak/>
-        <w:t>Overall Description</w:t>
-      </w:r>
-      <w:bookmarkEnd w:id="6"/>
+      <w:bookmarkStart w:id="20" w:name="_Toc5537907"/>
+      <w:r>
+        <w:t>Specific Requirements</w:t>
+      </w:r>
+      <w:bookmarkEnd w:id="20"/>
+      <w:r>
+        <w:t xml:space="preserve"> </w:t>
+      </w:r>
     </w:p>
     <w:p>
       <w:pPr>
@@ -1986,199 +2207,25 @@
         <w:t>SRS</w:t>
       </w:r>
       <w:r>
-        <w:t xml:space="preserve"> describes the general factors that affect the product and its requirements.  This section does not state specific requirements.  Instead, it provides a background for those requirements, which are defined in detail in Section 3, and makes them easier to understand. Include such items as: </w:t>
+        <w:t xml:space="preserve"> contains all software requirements to a level of detail sufficient to enable designers to design a system to satisfy those requirements, and testers to test that the system satisfies those requirements. When using use-case modeling, these requirements are captured in the Use Cases and the applicable supplementary specifications.  If use-case modeling is not used, the outline for supplementary specifications may be inserted directly into this section, as shown below.]</w:t>
       </w:r>
     </w:p>
     <w:p>
       <w:pPr>
         <w:pStyle w:val="Heading2"/>
       </w:pPr>
-      <w:bookmarkStart w:id="7" w:name="_Toc5537894"/>
-      <w:r>
-        <w:t>Product perspective</w:t>
-      </w:r>
-      <w:bookmarkEnd w:id="7"/>
-    </w:p>
-    <w:p>
-      <w:pPr>
-        <w:pStyle w:val="Heading3"/>
-        <w:rPr>
-          <w:highlight w:val="yellow"/>
-        </w:rPr>
-      </w:pPr>
-      <w:bookmarkStart w:id="8" w:name="_Toc5537895"/>
-      <w:r>
-        <w:rPr>
-          <w:highlight w:val="yellow"/>
-        </w:rPr>
-        <w:t xml:space="preserve">System </w:t>
-      </w:r>
-      <w:bookmarkEnd w:id="8"/>
-      <w:r>
-        <w:rPr>
-          <w:highlight w:val="yellow"/>
-        </w:rPr>
-        <w:t>Interfaces</w:t>
-      </w:r>
-    </w:p>
-    <w:p>
-      <w:pPr>
-        <w:pStyle w:val="Heading3"/>
-      </w:pPr>
-      <w:bookmarkStart w:id="9" w:name="_Toc5537896"/>
-      <w:r>
-        <w:t>User Interfaces</w:t>
-      </w:r>
-      <w:bookmarkEnd w:id="9"/>
-    </w:p>
-    <w:p>
-      <w:pPr>
-        <w:pStyle w:val="Heading3"/>
-        <w:rPr>
-          <w:highlight w:val="yellow"/>
-        </w:rPr>
-      </w:pPr>
-      <w:bookmarkStart w:id="10" w:name="_Toc5537897"/>
-      <w:r>
-        <w:rPr>
-          <w:highlight w:val="yellow"/>
-        </w:rPr>
-        <w:t>Hardware Interfaces</w:t>
-      </w:r>
-      <w:bookmarkEnd w:id="10"/>
-    </w:p>
-    <w:p>
-      <w:pPr>
-        <w:pStyle w:val="Heading3"/>
-      </w:pPr>
-      <w:bookmarkStart w:id="11" w:name="_Toc5537898"/>
-      <w:r>
-        <w:t>Software Interfaces</w:t>
-      </w:r>
-      <w:bookmarkEnd w:id="11"/>
-    </w:p>
-    <w:p>
-      <w:pPr>
-        <w:pStyle w:val="Heading3"/>
-        <w:rPr>
-          <w:highlight w:val="yellow"/>
-        </w:rPr>
-      </w:pPr>
-      <w:bookmarkStart w:id="12" w:name="_Toc5537899"/>
-      <w:r>
-        <w:rPr>
-          <w:highlight w:val="yellow"/>
-        </w:rPr>
-        <w:t>Communication Interfaces</w:t>
-      </w:r>
-      <w:bookmarkEnd w:id="12"/>
-    </w:p>
-    <w:p>
-      <w:pPr>
-        <w:pStyle w:val="Heading3"/>
-      </w:pPr>
-      <w:bookmarkStart w:id="13" w:name="_Toc5537900"/>
-      <w:r>
-        <w:t>Memory Constraints</w:t>
-      </w:r>
-      <w:bookmarkEnd w:id="13"/>
-    </w:p>
-    <w:p>
-      <w:pPr>
-        <w:pStyle w:val="Heading3"/>
-        <w:rPr>
-          <w:highlight w:val="yellow"/>
-        </w:rPr>
-      </w:pPr>
-      <w:bookmarkStart w:id="14" w:name="_Toc5537901"/>
-      <w:r>
-        <w:rPr>
-          <w:highlight w:val="yellow"/>
-        </w:rPr>
-        <w:t>Operations</w:t>
-      </w:r>
-      <w:bookmarkEnd w:id="14"/>
-    </w:p>
-    <w:p>
-      <w:pPr>
-        <w:pStyle w:val="Heading2"/>
-      </w:pPr>
-      <w:bookmarkStart w:id="15" w:name="_Toc5537902"/>
-      <w:r>
-        <w:t>Product functions</w:t>
-      </w:r>
-      <w:bookmarkEnd w:id="15"/>
-    </w:p>
-    <w:p>
-      <w:pPr>
-        <w:pStyle w:val="Heading2"/>
-      </w:pPr>
-      <w:bookmarkStart w:id="16" w:name="_Toc5537903"/>
-      <w:r>
-        <w:t>User characteristics</w:t>
-      </w:r>
-      <w:bookmarkEnd w:id="16"/>
-    </w:p>
-    <w:p>
-      <w:pPr>
-        <w:pStyle w:val="Heading2"/>
-      </w:pPr>
-      <w:bookmarkStart w:id="17" w:name="_Toc5537904"/>
-      <w:r>
-        <w:t>Constraints</w:t>
-      </w:r>
-      <w:bookmarkEnd w:id="17"/>
-    </w:p>
-    <w:p>
-      <w:pPr>
-        <w:pStyle w:val="Heading2"/>
-      </w:pPr>
-      <w:bookmarkStart w:id="18" w:name="_Toc5537905"/>
-      <w:r>
-        <w:t>Assumptions and dependencies</w:t>
-      </w:r>
-      <w:bookmarkEnd w:id="18"/>
-    </w:p>
-    <w:p>
-      <w:pPr>
-        <w:pStyle w:val="Heading2"/>
-        <w:rPr>
-          <w:highlight w:val="yellow"/>
-        </w:rPr>
-      </w:pPr>
-      <w:bookmarkStart w:id="19" w:name="_Toc5537906"/>
-      <w:r>
-        <w:rPr>
-          <w:highlight w:val="yellow"/>
-        </w:rPr>
-        <w:t>Requirements subsets</w:t>
-      </w:r>
-      <w:bookmarkEnd w:id="19"/>
-    </w:p>
-    <w:p>
-      <w:pPr>
-        <w:pStyle w:val="BodyText"/>
-      </w:pPr>
-    </w:p>
-    <w:p>
-      <w:pPr>
-        <w:pStyle w:val="Heading1"/>
-      </w:pPr>
-      <w:bookmarkStart w:id="20" w:name="_Toc5537907"/>
-      <w:r>
-        <w:t>Specific Requirements</w:t>
-      </w:r>
-      <w:bookmarkEnd w:id="20"/>
-      <w:r>
-        <w:t xml:space="preserve"> </w:t>
-      </w:r>
+      <w:bookmarkStart w:id="21" w:name="_Toc5537908"/>
+      <w:r>
+        <w:t>Functionality</w:t>
+      </w:r>
+      <w:bookmarkEnd w:id="21"/>
     </w:p>
     <w:p>
       <w:pPr>
         <w:pStyle w:val="InfoBlue"/>
       </w:pPr>
       <w:r>
-        <w:t xml:space="preserve">[This section of the </w:t>
+        <w:t xml:space="preserve">[This section describes the functional requirements of the system for those requirements that are expressed in the natural language style. For many applications, this may constitute the bulk of the </w:t>
       </w:r>
       <w:r>
         <w:rPr>
@@ -2188,34 +2235,6 @@
         <w:t>SRS</w:t>
       </w:r>
       <w:r>
-        <w:t xml:space="preserve"> contains all software requirements to a level of detail sufficient to enable designers to design a system to satisfy those requirements, and testers to test that the system satisfies those requirements. When using use-case modeling, these requirements are captured in the Use Cases and the applicable supplementary specifications.  If use-case modeling is not used, the outline for supplementary specifications may be inserted directly into this section, as shown below.]</w:t>
-      </w:r>
-    </w:p>
-    <w:p>
-      <w:pPr>
-        <w:pStyle w:val="Heading2"/>
-      </w:pPr>
-      <w:bookmarkStart w:id="21" w:name="_Toc5537908"/>
-      <w:r>
-        <w:t>Functionality</w:t>
-      </w:r>
-      <w:bookmarkEnd w:id="21"/>
-    </w:p>
-    <w:p>
-      <w:pPr>
-        <w:pStyle w:val="InfoBlue"/>
-      </w:pPr>
-      <w:r>
-        <w:t xml:space="preserve">[This section describes the functional requirements of the system for those requirements that are expressed in the natural language style. For many applications, this may constitute the bulk of the </w:t>
-      </w:r>
-      <w:r>
-        <w:rPr>
-          <w:b/>
-          <w:bCs/>
-        </w:rPr>
-        <w:t>SRS</w:t>
-      </w:r>
-      <w:r>
         <w:t xml:space="preserve"> package and thought should be given to the organization of this section. This section is typically organized by feature, but alternative organization methods may also be </w:t>
       </w:r>
       <w:proofErr w:type="gramStart"/>
@@ -2305,10 +2324,10 @@
         <w:ind w:left="720" w:firstLine="720"/>
       </w:pPr>
       <w:r>
-        <w:t>The C++ Arithmetic Expression Evaluator will be implemented using standard C++ and executed through a command-line interface. The system must evaluate arithmetic expressions efficiently and provide clear error messages for invalid input. Development constraints include using standard C++ libraries and ensuring the program compiles and runs in a typical C++ development environment.</w:t>
-      </w:r>
-      <w:r>
-        <w:tab/>
+        <w:t>The system must evaluate arithmetic expressions efficiently and provide clear error messages for invalid input. Development constraints include using standard C++ libraries</w:t>
+      </w:r>
+      <w:r>
+        <w:t>.</w:t>
       </w:r>
     </w:p>
     <w:p>
@@ -3125,352 +3144,6 @@
     </w:lvl>
   </w:abstractNum>
   <w:abstractNum w:abstractNumId="1" w15:restartNumberingAfterBreak="0">
-    <w:nsid w:val="FFFFFFFE"/>
-    <w:multiLevelType w:val="singleLevel"/>
-    <w:tmpl w:val="FFFFFFFF"/>
-    <w:lvl w:ilvl="0">
-      <w:numFmt w:val="decimal"/>
-      <w:lvlText w:val="*"/>
-      <w:lvlJc w:val="left"/>
-    </w:lvl>
-  </w:abstractNum>
-  <w:abstractNum w:abstractNumId="2" w15:restartNumberingAfterBreak="0">
-    <w:nsid w:val="00224753"/>
-    <w:multiLevelType w:val="singleLevel"/>
-    <w:tmpl w:val="04090001"/>
-    <w:lvl w:ilvl="0">
-      <w:start w:val="1"/>
-      <w:numFmt w:val="bullet"/>
-      <w:lvlText w:val=""/>
-      <w:lvlJc w:val="left"/>
-      <w:pPr>
-        <w:tabs>
-          <w:tab w:val="num" w:pos="360"/>
-        </w:tabs>
-        <w:ind w:left="360" w:hanging="360"/>
-      </w:pPr>
-      <w:rPr>
-        <w:rFonts w:ascii="Symbol" w:hAnsi="Symbol" w:hint="default"/>
-      </w:rPr>
-    </w:lvl>
-  </w:abstractNum>
-  <w:abstractNum w:abstractNumId="3" w15:restartNumberingAfterBreak="0">
-    <w:nsid w:val="03EC30BD"/>
-    <w:multiLevelType w:val="hybridMultilevel"/>
-    <w:tmpl w:val="E4C2812E"/>
-    <w:lvl w:ilvl="0" w:tplc="1F5ED464">
-      <w:start w:val="1"/>
-      <w:numFmt w:val="bullet"/>
-      <w:lvlText w:val=""/>
-      <w:lvlJc w:val="left"/>
-      <w:pPr>
-        <w:tabs>
-          <w:tab w:val="num" w:pos="1483"/>
-        </w:tabs>
-        <w:ind w:left="1483" w:hanging="360"/>
-      </w:pPr>
-      <w:rPr>
-        <w:rFonts w:ascii="Symbol" w:hAnsi="Symbol" w:hint="default"/>
-      </w:rPr>
-    </w:lvl>
-    <w:lvl w:ilvl="1" w:tplc="04090003">
-      <w:start w:val="1"/>
-      <w:numFmt w:val="bullet"/>
-      <w:lvlText w:val="o"/>
-      <w:lvlJc w:val="left"/>
-      <w:pPr>
-        <w:tabs>
-          <w:tab w:val="num" w:pos="1438"/>
-        </w:tabs>
-        <w:ind w:left="1438" w:hanging="360"/>
-      </w:pPr>
-      <w:rPr>
-        <w:rFonts w:ascii="Courier New" w:hAnsi="Courier New" w:hint="default"/>
-      </w:rPr>
-    </w:lvl>
-    <w:lvl w:ilvl="2" w:tplc="04090005" w:tentative="1">
-      <w:start w:val="1"/>
-      <w:numFmt w:val="bullet"/>
-      <w:lvlText w:val=""/>
-      <w:lvlJc w:val="left"/>
-      <w:pPr>
-        <w:tabs>
-          <w:tab w:val="num" w:pos="2158"/>
-        </w:tabs>
-        <w:ind w:left="2158" w:hanging="360"/>
-      </w:pPr>
-      <w:rPr>
-        <w:rFonts w:ascii="Wingdings" w:hAnsi="Wingdings" w:hint="default"/>
-      </w:rPr>
-    </w:lvl>
-    <w:lvl w:ilvl="3" w:tplc="04090001" w:tentative="1">
-      <w:start w:val="1"/>
-      <w:numFmt w:val="bullet"/>
-      <w:lvlText w:val=""/>
-      <w:lvlJc w:val="left"/>
-      <w:pPr>
-        <w:tabs>
-          <w:tab w:val="num" w:pos="2878"/>
-        </w:tabs>
-        <w:ind w:left="2878" w:hanging="360"/>
-      </w:pPr>
-      <w:rPr>
-        <w:rFonts w:ascii="Symbol" w:hAnsi="Symbol" w:hint="default"/>
-      </w:rPr>
-    </w:lvl>
-    <w:lvl w:ilvl="4" w:tplc="04090003" w:tentative="1">
-      <w:start w:val="1"/>
-      <w:numFmt w:val="bullet"/>
-      <w:lvlText w:val="o"/>
-      <w:lvlJc w:val="left"/>
-      <w:pPr>
-        <w:tabs>
-          <w:tab w:val="num" w:pos="3598"/>
-        </w:tabs>
-        <w:ind w:left="3598" w:hanging="360"/>
-      </w:pPr>
-      <w:rPr>
-        <w:rFonts w:ascii="Courier New" w:hAnsi="Courier New" w:hint="default"/>
-      </w:rPr>
-    </w:lvl>
-    <w:lvl w:ilvl="5" w:tplc="04090005" w:tentative="1">
-      <w:start w:val="1"/>
-      <w:numFmt w:val="bullet"/>
-      <w:lvlText w:val=""/>
-      <w:lvlJc w:val="left"/>
-      <w:pPr>
-        <w:tabs>
-          <w:tab w:val="num" w:pos="4318"/>
-        </w:tabs>
-        <w:ind w:left="4318" w:hanging="360"/>
-      </w:pPr>
-      <w:rPr>
-        <w:rFonts w:ascii="Wingdings" w:hAnsi="Wingdings" w:hint="default"/>
-      </w:rPr>
-    </w:lvl>
-    <w:lvl w:ilvl="6" w:tplc="04090001" w:tentative="1">
-      <w:start w:val="1"/>
-      <w:numFmt w:val="bullet"/>
-      <w:lvlText w:val=""/>
-      <w:lvlJc w:val="left"/>
-      <w:pPr>
-        <w:tabs>
-          <w:tab w:val="num" w:pos="5038"/>
-        </w:tabs>
-        <w:ind w:left="5038" w:hanging="360"/>
-      </w:pPr>
-      <w:rPr>
-        <w:rFonts w:ascii="Symbol" w:hAnsi="Symbol" w:hint="default"/>
-      </w:rPr>
-    </w:lvl>
-    <w:lvl w:ilvl="7" w:tplc="04090003" w:tentative="1">
-      <w:start w:val="1"/>
-      <w:numFmt w:val="bullet"/>
-      <w:lvlText w:val="o"/>
-      <w:lvlJc w:val="left"/>
-      <w:pPr>
-        <w:tabs>
-          <w:tab w:val="num" w:pos="5758"/>
-        </w:tabs>
-        <w:ind w:left="5758" w:hanging="360"/>
-      </w:pPr>
-      <w:rPr>
-        <w:rFonts w:ascii="Courier New" w:hAnsi="Courier New" w:hint="default"/>
-      </w:rPr>
-    </w:lvl>
-    <w:lvl w:ilvl="8" w:tplc="04090005" w:tentative="1">
-      <w:start w:val="1"/>
-      <w:numFmt w:val="bullet"/>
-      <w:lvlText w:val=""/>
-      <w:lvlJc w:val="left"/>
-      <w:pPr>
-        <w:tabs>
-          <w:tab w:val="num" w:pos="6478"/>
-        </w:tabs>
-        <w:ind w:left="6478" w:hanging="360"/>
-      </w:pPr>
-      <w:rPr>
-        <w:rFonts w:ascii="Wingdings" w:hAnsi="Wingdings" w:hint="default"/>
-      </w:rPr>
-    </w:lvl>
-  </w:abstractNum>
-  <w:abstractNum w:abstractNumId="4" w15:restartNumberingAfterBreak="0">
-    <w:nsid w:val="0A117094"/>
-    <w:multiLevelType w:val="singleLevel"/>
-    <w:tmpl w:val="04090001"/>
-    <w:lvl w:ilvl="0">
-      <w:start w:val="1"/>
-      <w:numFmt w:val="bullet"/>
-      <w:lvlText w:val=""/>
-      <w:lvlJc w:val="left"/>
-      <w:pPr>
-        <w:tabs>
-          <w:tab w:val="num" w:pos="360"/>
-        </w:tabs>
-        <w:ind w:left="360" w:hanging="360"/>
-      </w:pPr>
-      <w:rPr>
-        <w:rFonts w:ascii="Symbol" w:hAnsi="Symbol" w:hint="default"/>
-      </w:rPr>
-    </w:lvl>
-  </w:abstractNum>
-  <w:abstractNum w:abstractNumId="5" w15:restartNumberingAfterBreak="0">
-    <w:nsid w:val="17CB6DC4"/>
-    <w:multiLevelType w:val="singleLevel"/>
-    <w:tmpl w:val="04090001"/>
-    <w:lvl w:ilvl="0">
-      <w:start w:val="1"/>
-      <w:numFmt w:val="bullet"/>
-      <w:lvlText w:val=""/>
-      <w:lvlJc w:val="left"/>
-      <w:pPr>
-        <w:tabs>
-          <w:tab w:val="num" w:pos="360"/>
-        </w:tabs>
-        <w:ind w:left="360" w:hanging="360"/>
-      </w:pPr>
-      <w:rPr>
-        <w:rFonts w:ascii="Symbol" w:hAnsi="Symbol" w:hint="default"/>
-      </w:rPr>
-    </w:lvl>
-  </w:abstractNum>
-  <w:abstractNum w:abstractNumId="6" w15:restartNumberingAfterBreak="0">
-    <w:nsid w:val="185E023B"/>
-    <w:multiLevelType w:val="hybridMultilevel"/>
-    <w:tmpl w:val="BBFAF48A"/>
-    <w:lvl w:ilvl="0" w:tplc="669E317C">
-      <w:start w:val="1"/>
-      <w:numFmt w:val="lowerLetter"/>
-      <w:lvlText w:val="%1)"/>
-      <w:lvlJc w:val="left"/>
-      <w:pPr>
-        <w:tabs>
-          <w:tab w:val="num" w:pos="1125"/>
-        </w:tabs>
-        <w:ind w:left="1125" w:hanging="360"/>
-      </w:pPr>
-      <w:rPr>
-        <w:rFonts w:hint="default"/>
-      </w:rPr>
-    </w:lvl>
-    <w:lvl w:ilvl="1" w:tplc="04090019" w:tentative="1">
-      <w:start w:val="1"/>
-      <w:numFmt w:val="lowerLetter"/>
-      <w:lvlText w:val="%2."/>
-      <w:lvlJc w:val="left"/>
-      <w:pPr>
-        <w:tabs>
-          <w:tab w:val="num" w:pos="1845"/>
-        </w:tabs>
-        <w:ind w:left="1845" w:hanging="360"/>
-      </w:pPr>
-    </w:lvl>
-    <w:lvl w:ilvl="2" w:tplc="0409001B" w:tentative="1">
-      <w:start w:val="1"/>
-      <w:numFmt w:val="lowerRoman"/>
-      <w:lvlText w:val="%3."/>
-      <w:lvlJc w:val="right"/>
-      <w:pPr>
-        <w:tabs>
-          <w:tab w:val="num" w:pos="2565"/>
-        </w:tabs>
-        <w:ind w:left="2565" w:hanging="180"/>
-      </w:pPr>
-    </w:lvl>
-    <w:lvl w:ilvl="3" w:tplc="0409000F" w:tentative="1">
-      <w:start w:val="1"/>
-      <w:numFmt w:val="decimal"/>
-      <w:lvlText w:val="%4."/>
-      <w:lvlJc w:val="left"/>
-      <w:pPr>
-        <w:tabs>
-          <w:tab w:val="num" w:pos="3285"/>
-        </w:tabs>
-        <w:ind w:left="3285" w:hanging="360"/>
-      </w:pPr>
-    </w:lvl>
-    <w:lvl w:ilvl="4" w:tplc="04090019" w:tentative="1">
-      <w:start w:val="1"/>
-      <w:numFmt w:val="lowerLetter"/>
-      <w:lvlText w:val="%5."/>
-      <w:lvlJc w:val="left"/>
-      <w:pPr>
-        <w:tabs>
-          <w:tab w:val="num" w:pos="4005"/>
-        </w:tabs>
-        <w:ind w:left="4005" w:hanging="360"/>
-      </w:pPr>
-    </w:lvl>
-    <w:lvl w:ilvl="5" w:tplc="0409001B" w:tentative="1">
-      <w:start w:val="1"/>
-      <w:numFmt w:val="lowerRoman"/>
-      <w:lvlText w:val="%6."/>
-      <w:lvlJc w:val="right"/>
-      <w:pPr>
-        <w:tabs>
-          <w:tab w:val="num" w:pos="4725"/>
-        </w:tabs>
-        <w:ind w:left="4725" w:hanging="180"/>
-      </w:pPr>
-    </w:lvl>
-    <w:lvl w:ilvl="6" w:tplc="0409000F" w:tentative="1">
-      <w:start w:val="1"/>
-      <w:numFmt w:val="decimal"/>
-      <w:lvlText w:val="%7."/>
-      <w:lvlJc w:val="left"/>
-      <w:pPr>
-        <w:tabs>
-          <w:tab w:val="num" w:pos="5445"/>
-        </w:tabs>
-        <w:ind w:left="5445" w:hanging="360"/>
-      </w:pPr>
-    </w:lvl>
-    <w:lvl w:ilvl="7" w:tplc="04090019" w:tentative="1">
-      <w:start w:val="1"/>
-      <w:numFmt w:val="lowerLetter"/>
-      <w:lvlText w:val="%8."/>
-      <w:lvlJc w:val="left"/>
-      <w:pPr>
-        <w:tabs>
-          <w:tab w:val="num" w:pos="6165"/>
-        </w:tabs>
-        <w:ind w:left="6165" w:hanging="360"/>
-      </w:pPr>
-    </w:lvl>
-    <w:lvl w:ilvl="8" w:tplc="0409001B" w:tentative="1">
-      <w:start w:val="1"/>
-      <w:numFmt w:val="lowerRoman"/>
-      <w:lvlText w:val="%9."/>
-      <w:lvlJc w:val="right"/>
-      <w:pPr>
-        <w:tabs>
-          <w:tab w:val="num" w:pos="6885"/>
-        </w:tabs>
-        <w:ind w:left="6885" w:hanging="180"/>
-      </w:pPr>
-    </w:lvl>
-  </w:abstractNum>
-  <w:abstractNum w:abstractNumId="7" w15:restartNumberingAfterBreak="0">
-    <w:nsid w:val="22443AC4"/>
-    <w:multiLevelType w:val="singleLevel"/>
-    <w:tmpl w:val="12C0ACF8"/>
-    <w:lvl w:ilvl="0">
-      <w:start w:val="1"/>
-      <w:numFmt w:val="bullet"/>
-      <w:lvlText w:val=""/>
-      <w:lvlJc w:val="left"/>
-      <w:pPr>
-        <w:tabs>
-          <w:tab w:val="num" w:pos="360"/>
-        </w:tabs>
-        <w:ind w:left="360" w:hanging="360"/>
-      </w:pPr>
-      <w:rPr>
-        <w:rFonts w:ascii="Symbol" w:hAnsi="Symbol" w:hint="default"/>
-      </w:rPr>
-    </w:lvl>
-  </w:abstractNum>
-  <w:abstractNum w:abstractNumId="8" w15:restartNumberingAfterBreak="0">
     <w:nsid w:val="29AB40F1"/>
     <w:multiLevelType w:val="multilevel"/>
     <w:tmpl w:val="2F6A4596"/>
@@ -3584,1347 +3257,13 @@
       </w:pPr>
     </w:lvl>
   </w:abstractNum>
-  <w:abstractNum w:abstractNumId="9" w15:restartNumberingAfterBreak="0">
-    <w:nsid w:val="2D4B634E"/>
-    <w:multiLevelType w:val="singleLevel"/>
-    <w:tmpl w:val="04090001"/>
-    <w:lvl w:ilvl="0">
-      <w:start w:val="1"/>
-      <w:numFmt w:val="bullet"/>
-      <w:lvlText w:val=""/>
-      <w:lvlJc w:val="left"/>
-      <w:pPr>
-        <w:tabs>
-          <w:tab w:val="num" w:pos="360"/>
-        </w:tabs>
-        <w:ind w:left="360" w:hanging="360"/>
-      </w:pPr>
-      <w:rPr>
-        <w:rFonts w:ascii="Symbol" w:hAnsi="Symbol" w:hint="default"/>
-      </w:rPr>
-    </w:lvl>
-  </w:abstractNum>
-  <w:abstractNum w:abstractNumId="10" w15:restartNumberingAfterBreak="0">
-    <w:nsid w:val="31DD2C45"/>
-    <w:multiLevelType w:val="singleLevel"/>
-    <w:tmpl w:val="04090001"/>
-    <w:lvl w:ilvl="0">
-      <w:start w:val="1"/>
-      <w:numFmt w:val="bullet"/>
-      <w:lvlText w:val=""/>
-      <w:lvlJc w:val="left"/>
-      <w:pPr>
-        <w:tabs>
-          <w:tab w:val="num" w:pos="360"/>
-        </w:tabs>
-        <w:ind w:left="360" w:hanging="360"/>
-      </w:pPr>
-      <w:rPr>
-        <w:rFonts w:ascii="Symbol" w:hAnsi="Symbol" w:hint="default"/>
-      </w:rPr>
-    </w:lvl>
-  </w:abstractNum>
-  <w:abstractNum w:abstractNumId="11" w15:restartNumberingAfterBreak="0">
-    <w:nsid w:val="32982B51"/>
-    <w:multiLevelType w:val="singleLevel"/>
-    <w:tmpl w:val="04090001"/>
-    <w:lvl w:ilvl="0">
-      <w:start w:val="1"/>
-      <w:numFmt w:val="bullet"/>
-      <w:lvlText w:val=""/>
-      <w:lvlJc w:val="left"/>
-      <w:pPr>
-        <w:tabs>
-          <w:tab w:val="num" w:pos="360"/>
-        </w:tabs>
-        <w:ind w:left="360" w:hanging="360"/>
-      </w:pPr>
-      <w:rPr>
-        <w:rFonts w:ascii="Symbol" w:hAnsi="Symbol" w:hint="default"/>
-      </w:rPr>
-    </w:lvl>
-  </w:abstractNum>
-  <w:abstractNum w:abstractNumId="12" w15:restartNumberingAfterBreak="0">
-    <w:nsid w:val="3375481C"/>
-    <w:multiLevelType w:val="singleLevel"/>
-    <w:tmpl w:val="E6747DA6"/>
-    <w:lvl w:ilvl="0">
-      <w:start w:val="1"/>
-      <w:numFmt w:val="bullet"/>
-      <w:lvlText w:val=""/>
-      <w:lvlJc w:val="left"/>
-      <w:pPr>
-        <w:tabs>
-          <w:tab w:val="num" w:pos="360"/>
-        </w:tabs>
-        <w:ind w:left="360" w:hanging="360"/>
-      </w:pPr>
-      <w:rPr>
-        <w:rFonts w:ascii="Symbol" w:hAnsi="Symbol" w:hint="default"/>
-      </w:rPr>
-    </w:lvl>
-  </w:abstractNum>
-  <w:abstractNum w:abstractNumId="13" w15:restartNumberingAfterBreak="0">
-    <w:nsid w:val="369D5471"/>
-    <w:multiLevelType w:val="singleLevel"/>
-    <w:tmpl w:val="04090001"/>
-    <w:lvl w:ilvl="0">
-      <w:start w:val="1"/>
-      <w:numFmt w:val="bullet"/>
-      <w:lvlText w:val=""/>
-      <w:lvlJc w:val="left"/>
-      <w:pPr>
-        <w:tabs>
-          <w:tab w:val="num" w:pos="360"/>
-        </w:tabs>
-        <w:ind w:left="360" w:hanging="360"/>
-      </w:pPr>
-      <w:rPr>
-        <w:rFonts w:ascii="Symbol" w:hAnsi="Symbol" w:hint="default"/>
-      </w:rPr>
-    </w:lvl>
-  </w:abstractNum>
-  <w:abstractNum w:abstractNumId="14" w15:restartNumberingAfterBreak="0">
-    <w:nsid w:val="40745A96"/>
-    <w:multiLevelType w:val="hybridMultilevel"/>
-    <w:tmpl w:val="F1D879E6"/>
-    <w:lvl w:ilvl="0" w:tplc="1F5ED464">
-      <w:start w:val="1"/>
-      <w:numFmt w:val="bullet"/>
-      <w:lvlText w:val=""/>
-      <w:lvlJc w:val="left"/>
-      <w:pPr>
-        <w:tabs>
-          <w:tab w:val="num" w:pos="1483"/>
-        </w:tabs>
-        <w:ind w:left="1483" w:hanging="360"/>
-      </w:pPr>
-      <w:rPr>
-        <w:rFonts w:ascii="Symbol" w:hAnsi="Symbol" w:hint="default"/>
-      </w:rPr>
-    </w:lvl>
-    <w:lvl w:ilvl="1" w:tplc="04090003">
-      <w:start w:val="1"/>
-      <w:numFmt w:val="bullet"/>
-      <w:lvlText w:val="o"/>
-      <w:lvlJc w:val="left"/>
-      <w:pPr>
-        <w:tabs>
-          <w:tab w:val="num" w:pos="1438"/>
-        </w:tabs>
-        <w:ind w:left="1438" w:hanging="360"/>
-      </w:pPr>
-      <w:rPr>
-        <w:rFonts w:ascii="Courier New" w:hAnsi="Courier New" w:hint="default"/>
-      </w:rPr>
-    </w:lvl>
-    <w:lvl w:ilvl="2" w:tplc="04090005" w:tentative="1">
-      <w:start w:val="1"/>
-      <w:numFmt w:val="bullet"/>
-      <w:lvlText w:val=""/>
-      <w:lvlJc w:val="left"/>
-      <w:pPr>
-        <w:tabs>
-          <w:tab w:val="num" w:pos="2158"/>
-        </w:tabs>
-        <w:ind w:left="2158" w:hanging="360"/>
-      </w:pPr>
-      <w:rPr>
-        <w:rFonts w:ascii="Wingdings" w:hAnsi="Wingdings" w:hint="default"/>
-      </w:rPr>
-    </w:lvl>
-    <w:lvl w:ilvl="3" w:tplc="04090001" w:tentative="1">
-      <w:start w:val="1"/>
-      <w:numFmt w:val="bullet"/>
-      <w:lvlText w:val=""/>
-      <w:lvlJc w:val="left"/>
-      <w:pPr>
-        <w:tabs>
-          <w:tab w:val="num" w:pos="2878"/>
-        </w:tabs>
-        <w:ind w:left="2878" w:hanging="360"/>
-      </w:pPr>
-      <w:rPr>
-        <w:rFonts w:ascii="Symbol" w:hAnsi="Symbol" w:hint="default"/>
-      </w:rPr>
-    </w:lvl>
-    <w:lvl w:ilvl="4" w:tplc="04090003" w:tentative="1">
-      <w:start w:val="1"/>
-      <w:numFmt w:val="bullet"/>
-      <w:lvlText w:val="o"/>
-      <w:lvlJc w:val="left"/>
-      <w:pPr>
-        <w:tabs>
-          <w:tab w:val="num" w:pos="3598"/>
-        </w:tabs>
-        <w:ind w:left="3598" w:hanging="360"/>
-      </w:pPr>
-      <w:rPr>
-        <w:rFonts w:ascii="Courier New" w:hAnsi="Courier New" w:hint="default"/>
-      </w:rPr>
-    </w:lvl>
-    <w:lvl w:ilvl="5" w:tplc="04090005" w:tentative="1">
-      <w:start w:val="1"/>
-      <w:numFmt w:val="bullet"/>
-      <w:lvlText w:val=""/>
-      <w:lvlJc w:val="left"/>
-      <w:pPr>
-        <w:tabs>
-          <w:tab w:val="num" w:pos="4318"/>
-        </w:tabs>
-        <w:ind w:left="4318" w:hanging="360"/>
-      </w:pPr>
-      <w:rPr>
-        <w:rFonts w:ascii="Wingdings" w:hAnsi="Wingdings" w:hint="default"/>
-      </w:rPr>
-    </w:lvl>
-    <w:lvl w:ilvl="6" w:tplc="04090001" w:tentative="1">
-      <w:start w:val="1"/>
-      <w:numFmt w:val="bullet"/>
-      <w:lvlText w:val=""/>
-      <w:lvlJc w:val="left"/>
-      <w:pPr>
-        <w:tabs>
-          <w:tab w:val="num" w:pos="5038"/>
-        </w:tabs>
-        <w:ind w:left="5038" w:hanging="360"/>
-      </w:pPr>
-      <w:rPr>
-        <w:rFonts w:ascii="Symbol" w:hAnsi="Symbol" w:hint="default"/>
-      </w:rPr>
-    </w:lvl>
-    <w:lvl w:ilvl="7" w:tplc="04090003" w:tentative="1">
-      <w:start w:val="1"/>
-      <w:numFmt w:val="bullet"/>
-      <w:lvlText w:val="o"/>
-      <w:lvlJc w:val="left"/>
-      <w:pPr>
-        <w:tabs>
-          <w:tab w:val="num" w:pos="5758"/>
-        </w:tabs>
-        <w:ind w:left="5758" w:hanging="360"/>
-      </w:pPr>
-      <w:rPr>
-        <w:rFonts w:ascii="Courier New" w:hAnsi="Courier New" w:hint="default"/>
-      </w:rPr>
-    </w:lvl>
-    <w:lvl w:ilvl="8" w:tplc="04090005" w:tentative="1">
-      <w:start w:val="1"/>
-      <w:numFmt w:val="bullet"/>
-      <w:lvlText w:val=""/>
-      <w:lvlJc w:val="left"/>
-      <w:pPr>
-        <w:tabs>
-          <w:tab w:val="num" w:pos="6478"/>
-        </w:tabs>
-        <w:ind w:left="6478" w:hanging="360"/>
-      </w:pPr>
-      <w:rPr>
-        <w:rFonts w:ascii="Wingdings" w:hAnsi="Wingdings" w:hint="default"/>
-      </w:rPr>
-    </w:lvl>
-  </w:abstractNum>
-  <w:abstractNum w:abstractNumId="15" w15:restartNumberingAfterBreak="0">
-    <w:nsid w:val="40EC6812"/>
-    <w:multiLevelType w:val="hybridMultilevel"/>
-    <w:tmpl w:val="744284B2"/>
-    <w:lvl w:ilvl="0" w:tplc="1F5ED464">
-      <w:start w:val="1"/>
-      <w:numFmt w:val="bullet"/>
-      <w:lvlText w:val=""/>
-      <w:lvlJc w:val="left"/>
-      <w:pPr>
-        <w:tabs>
-          <w:tab w:val="num" w:pos="1483"/>
-        </w:tabs>
-        <w:ind w:left="1483" w:hanging="360"/>
-      </w:pPr>
-      <w:rPr>
-        <w:rFonts w:ascii="Symbol" w:hAnsi="Symbol" w:hint="default"/>
-      </w:rPr>
-    </w:lvl>
-    <w:lvl w:ilvl="1" w:tplc="04090003">
-      <w:start w:val="1"/>
-      <w:numFmt w:val="bullet"/>
-      <w:lvlText w:val="o"/>
-      <w:lvlJc w:val="left"/>
-      <w:pPr>
-        <w:tabs>
-          <w:tab w:val="num" w:pos="1438"/>
-        </w:tabs>
-        <w:ind w:left="1438" w:hanging="360"/>
-      </w:pPr>
-      <w:rPr>
-        <w:rFonts w:ascii="Courier New" w:hAnsi="Courier New" w:hint="default"/>
-      </w:rPr>
-    </w:lvl>
-    <w:lvl w:ilvl="2" w:tplc="04090005" w:tentative="1">
-      <w:start w:val="1"/>
-      <w:numFmt w:val="bullet"/>
-      <w:lvlText w:val=""/>
-      <w:lvlJc w:val="left"/>
-      <w:pPr>
-        <w:tabs>
-          <w:tab w:val="num" w:pos="2158"/>
-        </w:tabs>
-        <w:ind w:left="2158" w:hanging="360"/>
-      </w:pPr>
-      <w:rPr>
-        <w:rFonts w:ascii="Wingdings" w:hAnsi="Wingdings" w:hint="default"/>
-      </w:rPr>
-    </w:lvl>
-    <w:lvl w:ilvl="3" w:tplc="04090001" w:tentative="1">
-      <w:start w:val="1"/>
-      <w:numFmt w:val="bullet"/>
-      <w:lvlText w:val=""/>
-      <w:lvlJc w:val="left"/>
-      <w:pPr>
-        <w:tabs>
-          <w:tab w:val="num" w:pos="2878"/>
-        </w:tabs>
-        <w:ind w:left="2878" w:hanging="360"/>
-      </w:pPr>
-      <w:rPr>
-        <w:rFonts w:ascii="Symbol" w:hAnsi="Symbol" w:hint="default"/>
-      </w:rPr>
-    </w:lvl>
-    <w:lvl w:ilvl="4" w:tplc="04090003" w:tentative="1">
-      <w:start w:val="1"/>
-      <w:numFmt w:val="bullet"/>
-      <w:lvlText w:val="o"/>
-      <w:lvlJc w:val="left"/>
-      <w:pPr>
-        <w:tabs>
-          <w:tab w:val="num" w:pos="3598"/>
-        </w:tabs>
-        <w:ind w:left="3598" w:hanging="360"/>
-      </w:pPr>
-      <w:rPr>
-        <w:rFonts w:ascii="Courier New" w:hAnsi="Courier New" w:hint="default"/>
-      </w:rPr>
-    </w:lvl>
-    <w:lvl w:ilvl="5" w:tplc="04090005" w:tentative="1">
-      <w:start w:val="1"/>
-      <w:numFmt w:val="bullet"/>
-      <w:lvlText w:val=""/>
-      <w:lvlJc w:val="left"/>
-      <w:pPr>
-        <w:tabs>
-          <w:tab w:val="num" w:pos="4318"/>
-        </w:tabs>
-        <w:ind w:left="4318" w:hanging="360"/>
-      </w:pPr>
-      <w:rPr>
-        <w:rFonts w:ascii="Wingdings" w:hAnsi="Wingdings" w:hint="default"/>
-      </w:rPr>
-    </w:lvl>
-    <w:lvl w:ilvl="6" w:tplc="04090001" w:tentative="1">
-      <w:start w:val="1"/>
-      <w:numFmt w:val="bullet"/>
-      <w:lvlText w:val=""/>
-      <w:lvlJc w:val="left"/>
-      <w:pPr>
-        <w:tabs>
-          <w:tab w:val="num" w:pos="5038"/>
-        </w:tabs>
-        <w:ind w:left="5038" w:hanging="360"/>
-      </w:pPr>
-      <w:rPr>
-        <w:rFonts w:ascii="Symbol" w:hAnsi="Symbol" w:hint="default"/>
-      </w:rPr>
-    </w:lvl>
-    <w:lvl w:ilvl="7" w:tplc="04090003" w:tentative="1">
-      <w:start w:val="1"/>
-      <w:numFmt w:val="bullet"/>
-      <w:lvlText w:val="o"/>
-      <w:lvlJc w:val="left"/>
-      <w:pPr>
-        <w:tabs>
-          <w:tab w:val="num" w:pos="5758"/>
-        </w:tabs>
-        <w:ind w:left="5758" w:hanging="360"/>
-      </w:pPr>
-      <w:rPr>
-        <w:rFonts w:ascii="Courier New" w:hAnsi="Courier New" w:hint="default"/>
-      </w:rPr>
-    </w:lvl>
-    <w:lvl w:ilvl="8" w:tplc="04090005" w:tentative="1">
-      <w:start w:val="1"/>
-      <w:numFmt w:val="bullet"/>
-      <w:lvlText w:val=""/>
-      <w:lvlJc w:val="left"/>
-      <w:pPr>
-        <w:tabs>
-          <w:tab w:val="num" w:pos="6478"/>
-        </w:tabs>
-        <w:ind w:left="6478" w:hanging="360"/>
-      </w:pPr>
-      <w:rPr>
-        <w:rFonts w:ascii="Wingdings" w:hAnsi="Wingdings" w:hint="default"/>
-      </w:rPr>
-    </w:lvl>
-  </w:abstractNum>
-  <w:abstractNum w:abstractNumId="16" w15:restartNumberingAfterBreak="0">
-    <w:nsid w:val="42B97F7B"/>
-    <w:multiLevelType w:val="singleLevel"/>
-    <w:tmpl w:val="04090001"/>
-    <w:lvl w:ilvl="0">
-      <w:start w:val="1"/>
-      <w:numFmt w:val="bullet"/>
-      <w:lvlText w:val=""/>
-      <w:lvlJc w:val="left"/>
-      <w:pPr>
-        <w:tabs>
-          <w:tab w:val="num" w:pos="360"/>
-        </w:tabs>
-        <w:ind w:left="360" w:hanging="360"/>
-      </w:pPr>
-      <w:rPr>
-        <w:rFonts w:ascii="Symbol" w:hAnsi="Symbol" w:hint="default"/>
-      </w:rPr>
-    </w:lvl>
-  </w:abstractNum>
-  <w:abstractNum w:abstractNumId="17" w15:restartNumberingAfterBreak="0">
-    <w:nsid w:val="49E170D0"/>
-    <w:multiLevelType w:val="singleLevel"/>
-    <w:tmpl w:val="04090001"/>
-    <w:lvl w:ilvl="0">
-      <w:start w:val="1"/>
-      <w:numFmt w:val="bullet"/>
-      <w:lvlText w:val=""/>
-      <w:lvlJc w:val="left"/>
-      <w:pPr>
-        <w:tabs>
-          <w:tab w:val="num" w:pos="360"/>
-        </w:tabs>
-        <w:ind w:left="360" w:hanging="360"/>
-      </w:pPr>
-      <w:rPr>
-        <w:rFonts w:ascii="Symbol" w:hAnsi="Symbol" w:hint="default"/>
-      </w:rPr>
-    </w:lvl>
-  </w:abstractNum>
-  <w:abstractNum w:abstractNumId="18" w15:restartNumberingAfterBreak="0">
-    <w:nsid w:val="4F64732B"/>
-    <w:multiLevelType w:val="singleLevel"/>
-    <w:tmpl w:val="04090001"/>
-    <w:lvl w:ilvl="0">
-      <w:start w:val="1"/>
-      <w:numFmt w:val="bullet"/>
-      <w:lvlText w:val=""/>
-      <w:lvlJc w:val="left"/>
-      <w:pPr>
-        <w:tabs>
-          <w:tab w:val="num" w:pos="360"/>
-        </w:tabs>
-        <w:ind w:left="360" w:hanging="360"/>
-      </w:pPr>
-      <w:rPr>
-        <w:rFonts w:ascii="Symbol" w:hAnsi="Symbol" w:hint="default"/>
-      </w:rPr>
-    </w:lvl>
-  </w:abstractNum>
-  <w:abstractNum w:abstractNumId="19" w15:restartNumberingAfterBreak="0">
-    <w:nsid w:val="52DF734E"/>
-    <w:multiLevelType w:val="singleLevel"/>
-    <w:tmpl w:val="04090001"/>
-    <w:lvl w:ilvl="0">
-      <w:start w:val="1"/>
-      <w:numFmt w:val="bullet"/>
-      <w:lvlText w:val=""/>
-      <w:lvlJc w:val="left"/>
-      <w:pPr>
-        <w:tabs>
-          <w:tab w:val="num" w:pos="360"/>
-        </w:tabs>
-        <w:ind w:left="360" w:hanging="360"/>
-      </w:pPr>
-      <w:rPr>
-        <w:rFonts w:ascii="Symbol" w:hAnsi="Symbol" w:hint="default"/>
-      </w:rPr>
-    </w:lvl>
-  </w:abstractNum>
-  <w:abstractNum w:abstractNumId="20" w15:restartNumberingAfterBreak="0">
-    <w:nsid w:val="606962A1"/>
-    <w:multiLevelType w:val="hybridMultilevel"/>
-    <w:tmpl w:val="EB34D1CC"/>
-    <w:lvl w:ilvl="0" w:tplc="1F5ED464">
-      <w:start w:val="1"/>
-      <w:numFmt w:val="bullet"/>
-      <w:lvlText w:val=""/>
-      <w:lvlJc w:val="left"/>
-      <w:pPr>
-        <w:tabs>
-          <w:tab w:val="num" w:pos="1485"/>
-        </w:tabs>
-        <w:ind w:left="1485" w:hanging="360"/>
-      </w:pPr>
-      <w:rPr>
-        <w:rFonts w:ascii="Symbol" w:hAnsi="Symbol" w:hint="default"/>
-      </w:rPr>
-    </w:lvl>
-    <w:lvl w:ilvl="1" w:tplc="04090003" w:tentative="1">
-      <w:start w:val="1"/>
-      <w:numFmt w:val="bullet"/>
-      <w:lvlText w:val="o"/>
-      <w:lvlJc w:val="left"/>
-      <w:pPr>
-        <w:tabs>
-          <w:tab w:val="num" w:pos="2205"/>
-        </w:tabs>
-        <w:ind w:left="2205" w:hanging="360"/>
-      </w:pPr>
-      <w:rPr>
-        <w:rFonts w:ascii="Courier New" w:hAnsi="Courier New" w:hint="default"/>
-      </w:rPr>
-    </w:lvl>
-    <w:lvl w:ilvl="2" w:tplc="04090005" w:tentative="1">
-      <w:start w:val="1"/>
-      <w:numFmt w:val="bullet"/>
-      <w:lvlText w:val=""/>
-      <w:lvlJc w:val="left"/>
-      <w:pPr>
-        <w:tabs>
-          <w:tab w:val="num" w:pos="2925"/>
-        </w:tabs>
-        <w:ind w:left="2925" w:hanging="360"/>
-      </w:pPr>
-      <w:rPr>
-        <w:rFonts w:ascii="Wingdings" w:hAnsi="Wingdings" w:hint="default"/>
-      </w:rPr>
-    </w:lvl>
-    <w:lvl w:ilvl="3" w:tplc="04090001" w:tentative="1">
-      <w:start w:val="1"/>
-      <w:numFmt w:val="bullet"/>
-      <w:lvlText w:val=""/>
-      <w:lvlJc w:val="left"/>
-      <w:pPr>
-        <w:tabs>
-          <w:tab w:val="num" w:pos="3645"/>
-        </w:tabs>
-        <w:ind w:left="3645" w:hanging="360"/>
-      </w:pPr>
-      <w:rPr>
-        <w:rFonts w:ascii="Symbol" w:hAnsi="Symbol" w:hint="default"/>
-      </w:rPr>
-    </w:lvl>
-    <w:lvl w:ilvl="4" w:tplc="04090003" w:tentative="1">
-      <w:start w:val="1"/>
-      <w:numFmt w:val="bullet"/>
-      <w:lvlText w:val="o"/>
-      <w:lvlJc w:val="left"/>
-      <w:pPr>
-        <w:tabs>
-          <w:tab w:val="num" w:pos="4365"/>
-        </w:tabs>
-        <w:ind w:left="4365" w:hanging="360"/>
-      </w:pPr>
-      <w:rPr>
-        <w:rFonts w:ascii="Courier New" w:hAnsi="Courier New" w:hint="default"/>
-      </w:rPr>
-    </w:lvl>
-    <w:lvl w:ilvl="5" w:tplc="04090005" w:tentative="1">
-      <w:start w:val="1"/>
-      <w:numFmt w:val="bullet"/>
-      <w:lvlText w:val=""/>
-      <w:lvlJc w:val="left"/>
-      <w:pPr>
-        <w:tabs>
-          <w:tab w:val="num" w:pos="5085"/>
-        </w:tabs>
-        <w:ind w:left="5085" w:hanging="360"/>
-      </w:pPr>
-      <w:rPr>
-        <w:rFonts w:ascii="Wingdings" w:hAnsi="Wingdings" w:hint="default"/>
-      </w:rPr>
-    </w:lvl>
-    <w:lvl w:ilvl="6" w:tplc="04090001" w:tentative="1">
-      <w:start w:val="1"/>
-      <w:numFmt w:val="bullet"/>
-      <w:lvlText w:val=""/>
-      <w:lvlJc w:val="left"/>
-      <w:pPr>
-        <w:tabs>
-          <w:tab w:val="num" w:pos="5805"/>
-        </w:tabs>
-        <w:ind w:left="5805" w:hanging="360"/>
-      </w:pPr>
-      <w:rPr>
-        <w:rFonts w:ascii="Symbol" w:hAnsi="Symbol" w:hint="default"/>
-      </w:rPr>
-    </w:lvl>
-    <w:lvl w:ilvl="7" w:tplc="04090003" w:tentative="1">
-      <w:start w:val="1"/>
-      <w:numFmt w:val="bullet"/>
-      <w:lvlText w:val="o"/>
-      <w:lvlJc w:val="left"/>
-      <w:pPr>
-        <w:tabs>
-          <w:tab w:val="num" w:pos="6525"/>
-        </w:tabs>
-        <w:ind w:left="6525" w:hanging="360"/>
-      </w:pPr>
-      <w:rPr>
-        <w:rFonts w:ascii="Courier New" w:hAnsi="Courier New" w:hint="default"/>
-      </w:rPr>
-    </w:lvl>
-    <w:lvl w:ilvl="8" w:tplc="04090005" w:tentative="1">
-      <w:start w:val="1"/>
-      <w:numFmt w:val="bullet"/>
-      <w:lvlText w:val=""/>
-      <w:lvlJc w:val="left"/>
-      <w:pPr>
-        <w:tabs>
-          <w:tab w:val="num" w:pos="7245"/>
-        </w:tabs>
-        <w:ind w:left="7245" w:hanging="360"/>
-      </w:pPr>
-      <w:rPr>
-        <w:rFonts w:ascii="Wingdings" w:hAnsi="Wingdings" w:hint="default"/>
-      </w:rPr>
-    </w:lvl>
-  </w:abstractNum>
-  <w:abstractNum w:abstractNumId="21" w15:restartNumberingAfterBreak="0">
-    <w:nsid w:val="66807FD9"/>
-    <w:multiLevelType w:val="hybridMultilevel"/>
-    <w:tmpl w:val="EDA6B834"/>
-    <w:lvl w:ilvl="0" w:tplc="04090001">
-      <w:start w:val="1"/>
-      <w:numFmt w:val="bullet"/>
-      <w:lvlText w:val=""/>
-      <w:lvlJc w:val="left"/>
-      <w:pPr>
-        <w:tabs>
-          <w:tab w:val="num" w:pos="1440"/>
-        </w:tabs>
-        <w:ind w:left="1440" w:hanging="360"/>
-      </w:pPr>
-      <w:rPr>
-        <w:rFonts w:ascii="Symbol" w:hAnsi="Symbol" w:hint="default"/>
-      </w:rPr>
-    </w:lvl>
-    <w:lvl w:ilvl="1" w:tplc="04090003" w:tentative="1">
-      <w:start w:val="1"/>
-      <w:numFmt w:val="bullet"/>
-      <w:lvlText w:val="o"/>
-      <w:lvlJc w:val="left"/>
-      <w:pPr>
-        <w:tabs>
-          <w:tab w:val="num" w:pos="2160"/>
-        </w:tabs>
-        <w:ind w:left="2160" w:hanging="360"/>
-      </w:pPr>
-      <w:rPr>
-        <w:rFonts w:ascii="Courier New" w:hAnsi="Courier New" w:hint="default"/>
-      </w:rPr>
-    </w:lvl>
-    <w:lvl w:ilvl="2" w:tplc="04090005" w:tentative="1">
-      <w:start w:val="1"/>
-      <w:numFmt w:val="bullet"/>
-      <w:lvlText w:val=""/>
-      <w:lvlJc w:val="left"/>
-      <w:pPr>
-        <w:tabs>
-          <w:tab w:val="num" w:pos="2880"/>
-        </w:tabs>
-        <w:ind w:left="2880" w:hanging="360"/>
-      </w:pPr>
-      <w:rPr>
-        <w:rFonts w:ascii="Wingdings" w:hAnsi="Wingdings" w:hint="default"/>
-      </w:rPr>
-    </w:lvl>
-    <w:lvl w:ilvl="3" w:tplc="04090001" w:tentative="1">
-      <w:start w:val="1"/>
-      <w:numFmt w:val="bullet"/>
-      <w:lvlText w:val=""/>
-      <w:lvlJc w:val="left"/>
-      <w:pPr>
-        <w:tabs>
-          <w:tab w:val="num" w:pos="3600"/>
-        </w:tabs>
-        <w:ind w:left="3600" w:hanging="360"/>
-      </w:pPr>
-      <w:rPr>
-        <w:rFonts w:ascii="Symbol" w:hAnsi="Symbol" w:hint="default"/>
-      </w:rPr>
-    </w:lvl>
-    <w:lvl w:ilvl="4" w:tplc="04090003" w:tentative="1">
-      <w:start w:val="1"/>
-      <w:numFmt w:val="bullet"/>
-      <w:lvlText w:val="o"/>
-      <w:lvlJc w:val="left"/>
-      <w:pPr>
-        <w:tabs>
-          <w:tab w:val="num" w:pos="4320"/>
-        </w:tabs>
-        <w:ind w:left="4320" w:hanging="360"/>
-      </w:pPr>
-      <w:rPr>
-        <w:rFonts w:ascii="Courier New" w:hAnsi="Courier New" w:hint="default"/>
-      </w:rPr>
-    </w:lvl>
-    <w:lvl w:ilvl="5" w:tplc="04090005" w:tentative="1">
-      <w:start w:val="1"/>
-      <w:numFmt w:val="bullet"/>
-      <w:lvlText w:val=""/>
-      <w:lvlJc w:val="left"/>
-      <w:pPr>
-        <w:tabs>
-          <w:tab w:val="num" w:pos="5040"/>
-        </w:tabs>
-        <w:ind w:left="5040" w:hanging="360"/>
-      </w:pPr>
-      <w:rPr>
-        <w:rFonts w:ascii="Wingdings" w:hAnsi="Wingdings" w:hint="default"/>
-      </w:rPr>
-    </w:lvl>
-    <w:lvl w:ilvl="6" w:tplc="04090001" w:tentative="1">
-      <w:start w:val="1"/>
-      <w:numFmt w:val="bullet"/>
-      <w:lvlText w:val=""/>
-      <w:lvlJc w:val="left"/>
-      <w:pPr>
-        <w:tabs>
-          <w:tab w:val="num" w:pos="5760"/>
-        </w:tabs>
-        <w:ind w:left="5760" w:hanging="360"/>
-      </w:pPr>
-      <w:rPr>
-        <w:rFonts w:ascii="Symbol" w:hAnsi="Symbol" w:hint="default"/>
-      </w:rPr>
-    </w:lvl>
-    <w:lvl w:ilvl="7" w:tplc="04090003" w:tentative="1">
-      <w:start w:val="1"/>
-      <w:numFmt w:val="bullet"/>
-      <w:lvlText w:val="o"/>
-      <w:lvlJc w:val="left"/>
-      <w:pPr>
-        <w:tabs>
-          <w:tab w:val="num" w:pos="6480"/>
-        </w:tabs>
-        <w:ind w:left="6480" w:hanging="360"/>
-      </w:pPr>
-      <w:rPr>
-        <w:rFonts w:ascii="Courier New" w:hAnsi="Courier New" w:hint="default"/>
-      </w:rPr>
-    </w:lvl>
-    <w:lvl w:ilvl="8" w:tplc="04090005" w:tentative="1">
-      <w:start w:val="1"/>
-      <w:numFmt w:val="bullet"/>
-      <w:lvlText w:val=""/>
-      <w:lvlJc w:val="left"/>
-      <w:pPr>
-        <w:tabs>
-          <w:tab w:val="num" w:pos="7200"/>
-        </w:tabs>
-        <w:ind w:left="7200" w:hanging="360"/>
-      </w:pPr>
-      <w:rPr>
-        <w:rFonts w:ascii="Wingdings" w:hAnsi="Wingdings" w:hint="default"/>
-      </w:rPr>
-    </w:lvl>
-  </w:abstractNum>
-  <w:abstractNum w:abstractNumId="22" w15:restartNumberingAfterBreak="0">
-    <w:nsid w:val="6D2F7D46"/>
-    <w:multiLevelType w:val="singleLevel"/>
-    <w:tmpl w:val="04090001"/>
-    <w:lvl w:ilvl="0">
-      <w:start w:val="1"/>
-      <w:numFmt w:val="bullet"/>
-      <w:lvlText w:val=""/>
-      <w:lvlJc w:val="left"/>
-      <w:pPr>
-        <w:tabs>
-          <w:tab w:val="num" w:pos="360"/>
-        </w:tabs>
-        <w:ind w:left="360" w:hanging="360"/>
-      </w:pPr>
-      <w:rPr>
-        <w:rFonts w:ascii="Symbol" w:hAnsi="Symbol" w:hint="default"/>
-      </w:rPr>
-    </w:lvl>
-  </w:abstractNum>
-  <w:abstractNum w:abstractNumId="23" w15:restartNumberingAfterBreak="0">
-    <w:nsid w:val="6D8859E9"/>
-    <w:multiLevelType w:val="hybridMultilevel"/>
-    <w:tmpl w:val="68C4A246"/>
-    <w:lvl w:ilvl="0" w:tplc="ECDEAA52">
-      <w:start w:val="1"/>
-      <w:numFmt w:val="bullet"/>
-      <w:lvlText w:val=""/>
-      <w:lvlJc w:val="left"/>
-      <w:pPr>
-        <w:tabs>
-          <w:tab w:val="num" w:pos="1485"/>
-        </w:tabs>
-        <w:ind w:left="1485" w:hanging="360"/>
-      </w:pPr>
-      <w:rPr>
-        <w:rFonts w:ascii="Symbol" w:hAnsi="Symbol" w:hint="default"/>
-      </w:rPr>
-    </w:lvl>
-    <w:lvl w:ilvl="1" w:tplc="04090003" w:tentative="1">
-      <w:start w:val="1"/>
-      <w:numFmt w:val="bullet"/>
-      <w:lvlText w:val="o"/>
-      <w:lvlJc w:val="left"/>
-      <w:pPr>
-        <w:tabs>
-          <w:tab w:val="num" w:pos="2205"/>
-        </w:tabs>
-        <w:ind w:left="2205" w:hanging="360"/>
-      </w:pPr>
-      <w:rPr>
-        <w:rFonts w:ascii="Courier New" w:hAnsi="Courier New" w:hint="default"/>
-      </w:rPr>
-    </w:lvl>
-    <w:lvl w:ilvl="2" w:tplc="04090005" w:tentative="1">
-      <w:start w:val="1"/>
-      <w:numFmt w:val="bullet"/>
-      <w:lvlText w:val=""/>
-      <w:lvlJc w:val="left"/>
-      <w:pPr>
-        <w:tabs>
-          <w:tab w:val="num" w:pos="2925"/>
-        </w:tabs>
-        <w:ind w:left="2925" w:hanging="360"/>
-      </w:pPr>
-      <w:rPr>
-        <w:rFonts w:ascii="Wingdings" w:hAnsi="Wingdings" w:hint="default"/>
-      </w:rPr>
-    </w:lvl>
-    <w:lvl w:ilvl="3" w:tplc="04090001" w:tentative="1">
-      <w:start w:val="1"/>
-      <w:numFmt w:val="bullet"/>
-      <w:lvlText w:val=""/>
-      <w:lvlJc w:val="left"/>
-      <w:pPr>
-        <w:tabs>
-          <w:tab w:val="num" w:pos="3645"/>
-        </w:tabs>
-        <w:ind w:left="3645" w:hanging="360"/>
-      </w:pPr>
-      <w:rPr>
-        <w:rFonts w:ascii="Symbol" w:hAnsi="Symbol" w:hint="default"/>
-      </w:rPr>
-    </w:lvl>
-    <w:lvl w:ilvl="4" w:tplc="04090003" w:tentative="1">
-      <w:start w:val="1"/>
-      <w:numFmt w:val="bullet"/>
-      <w:lvlText w:val="o"/>
-      <w:lvlJc w:val="left"/>
-      <w:pPr>
-        <w:tabs>
-          <w:tab w:val="num" w:pos="4365"/>
-        </w:tabs>
-        <w:ind w:left="4365" w:hanging="360"/>
-      </w:pPr>
-      <w:rPr>
-        <w:rFonts w:ascii="Courier New" w:hAnsi="Courier New" w:hint="default"/>
-      </w:rPr>
-    </w:lvl>
-    <w:lvl w:ilvl="5" w:tplc="04090005" w:tentative="1">
-      <w:start w:val="1"/>
-      <w:numFmt w:val="bullet"/>
-      <w:lvlText w:val=""/>
-      <w:lvlJc w:val="left"/>
-      <w:pPr>
-        <w:tabs>
-          <w:tab w:val="num" w:pos="5085"/>
-        </w:tabs>
-        <w:ind w:left="5085" w:hanging="360"/>
-      </w:pPr>
-      <w:rPr>
-        <w:rFonts w:ascii="Wingdings" w:hAnsi="Wingdings" w:hint="default"/>
-      </w:rPr>
-    </w:lvl>
-    <w:lvl w:ilvl="6" w:tplc="04090001" w:tentative="1">
-      <w:start w:val="1"/>
-      <w:numFmt w:val="bullet"/>
-      <w:lvlText w:val=""/>
-      <w:lvlJc w:val="left"/>
-      <w:pPr>
-        <w:tabs>
-          <w:tab w:val="num" w:pos="5805"/>
-        </w:tabs>
-        <w:ind w:left="5805" w:hanging="360"/>
-      </w:pPr>
-      <w:rPr>
-        <w:rFonts w:ascii="Symbol" w:hAnsi="Symbol" w:hint="default"/>
-      </w:rPr>
-    </w:lvl>
-    <w:lvl w:ilvl="7" w:tplc="04090003" w:tentative="1">
-      <w:start w:val="1"/>
-      <w:numFmt w:val="bullet"/>
-      <w:lvlText w:val="o"/>
-      <w:lvlJc w:val="left"/>
-      <w:pPr>
-        <w:tabs>
-          <w:tab w:val="num" w:pos="6525"/>
-        </w:tabs>
-        <w:ind w:left="6525" w:hanging="360"/>
-      </w:pPr>
-      <w:rPr>
-        <w:rFonts w:ascii="Courier New" w:hAnsi="Courier New" w:hint="default"/>
-      </w:rPr>
-    </w:lvl>
-    <w:lvl w:ilvl="8" w:tplc="04090005" w:tentative="1">
-      <w:start w:val="1"/>
-      <w:numFmt w:val="bullet"/>
-      <w:lvlText w:val=""/>
-      <w:lvlJc w:val="left"/>
-      <w:pPr>
-        <w:tabs>
-          <w:tab w:val="num" w:pos="7245"/>
-        </w:tabs>
-        <w:ind w:left="7245" w:hanging="360"/>
-      </w:pPr>
-      <w:rPr>
-        <w:rFonts w:ascii="Wingdings" w:hAnsi="Wingdings" w:hint="default"/>
-      </w:rPr>
-    </w:lvl>
-  </w:abstractNum>
-  <w:abstractNum w:abstractNumId="24" w15:restartNumberingAfterBreak="0">
-    <w:nsid w:val="71F21F2A"/>
-    <w:multiLevelType w:val="singleLevel"/>
-    <w:tmpl w:val="04090001"/>
-    <w:lvl w:ilvl="0">
-      <w:start w:val="1"/>
-      <w:numFmt w:val="bullet"/>
-      <w:lvlText w:val=""/>
-      <w:lvlJc w:val="left"/>
-      <w:pPr>
-        <w:tabs>
-          <w:tab w:val="num" w:pos="360"/>
-        </w:tabs>
-        <w:ind w:left="360" w:hanging="360"/>
-      </w:pPr>
-      <w:rPr>
-        <w:rFonts w:ascii="Symbol" w:hAnsi="Symbol" w:hint="default"/>
-      </w:rPr>
-    </w:lvl>
-  </w:abstractNum>
-  <w:abstractNum w:abstractNumId="25" w15:restartNumberingAfterBreak="0">
-    <w:nsid w:val="743601FB"/>
-    <w:multiLevelType w:val="singleLevel"/>
-    <w:tmpl w:val="04090001"/>
-    <w:lvl w:ilvl="0">
-      <w:start w:val="1"/>
-      <w:numFmt w:val="bullet"/>
-      <w:lvlText w:val=""/>
-      <w:lvlJc w:val="left"/>
-      <w:pPr>
-        <w:tabs>
-          <w:tab w:val="num" w:pos="360"/>
-        </w:tabs>
-        <w:ind w:left="360" w:hanging="360"/>
-      </w:pPr>
-      <w:rPr>
-        <w:rFonts w:ascii="Symbol" w:hAnsi="Symbol" w:hint="default"/>
-      </w:rPr>
-    </w:lvl>
-  </w:abstractNum>
-  <w:abstractNum w:abstractNumId="26" w15:restartNumberingAfterBreak="0">
-    <w:nsid w:val="756150CA"/>
-    <w:multiLevelType w:val="singleLevel"/>
-    <w:tmpl w:val="04090001"/>
-    <w:lvl w:ilvl="0">
-      <w:start w:val="1"/>
-      <w:numFmt w:val="bullet"/>
-      <w:lvlText w:val=""/>
-      <w:lvlJc w:val="left"/>
-      <w:pPr>
-        <w:tabs>
-          <w:tab w:val="num" w:pos="360"/>
-        </w:tabs>
-        <w:ind w:left="360" w:hanging="360"/>
-      </w:pPr>
-      <w:rPr>
-        <w:rFonts w:ascii="Symbol" w:hAnsi="Symbol" w:hint="default"/>
-      </w:rPr>
-    </w:lvl>
-  </w:abstractNum>
-  <w:abstractNum w:abstractNumId="27" w15:restartNumberingAfterBreak="0">
-    <w:nsid w:val="7BE434D7"/>
-    <w:multiLevelType w:val="singleLevel"/>
-    <w:tmpl w:val="04090001"/>
-    <w:lvl w:ilvl="0">
-      <w:start w:val="1"/>
-      <w:numFmt w:val="bullet"/>
-      <w:lvlText w:val=""/>
-      <w:lvlJc w:val="left"/>
-      <w:pPr>
-        <w:tabs>
-          <w:tab w:val="num" w:pos="360"/>
-        </w:tabs>
-        <w:ind w:left="360" w:hanging="360"/>
-      </w:pPr>
-      <w:rPr>
-        <w:rFonts w:ascii="Symbol" w:hAnsi="Symbol" w:hint="default"/>
-      </w:rPr>
-    </w:lvl>
-  </w:abstractNum>
-  <w:abstractNum w:abstractNumId="28" w15:restartNumberingAfterBreak="0">
-    <w:nsid w:val="7C285540"/>
-    <w:multiLevelType w:val="hybridMultilevel"/>
-    <w:tmpl w:val="70C83E90"/>
-    <w:lvl w:ilvl="0" w:tplc="1F5ED464">
-      <w:start w:val="1"/>
-      <w:numFmt w:val="bullet"/>
-      <w:lvlText w:val=""/>
-      <w:lvlJc w:val="left"/>
-      <w:pPr>
-        <w:tabs>
-          <w:tab w:val="num" w:pos="1483"/>
-        </w:tabs>
-        <w:ind w:left="1483" w:hanging="360"/>
-      </w:pPr>
-      <w:rPr>
-        <w:rFonts w:ascii="Symbol" w:hAnsi="Symbol" w:hint="default"/>
-      </w:rPr>
-    </w:lvl>
-    <w:lvl w:ilvl="1" w:tplc="04090003">
-      <w:start w:val="1"/>
-      <w:numFmt w:val="bullet"/>
-      <w:lvlText w:val="o"/>
-      <w:lvlJc w:val="left"/>
-      <w:pPr>
-        <w:tabs>
-          <w:tab w:val="num" w:pos="1438"/>
-        </w:tabs>
-        <w:ind w:left="1438" w:hanging="360"/>
-      </w:pPr>
-      <w:rPr>
-        <w:rFonts w:ascii="Courier New" w:hAnsi="Courier New" w:hint="default"/>
-      </w:rPr>
-    </w:lvl>
-    <w:lvl w:ilvl="2" w:tplc="04090005" w:tentative="1">
-      <w:start w:val="1"/>
-      <w:numFmt w:val="bullet"/>
-      <w:lvlText w:val=""/>
-      <w:lvlJc w:val="left"/>
-      <w:pPr>
-        <w:tabs>
-          <w:tab w:val="num" w:pos="2158"/>
-        </w:tabs>
-        <w:ind w:left="2158" w:hanging="360"/>
-      </w:pPr>
-      <w:rPr>
-        <w:rFonts w:ascii="Wingdings" w:hAnsi="Wingdings" w:hint="default"/>
-      </w:rPr>
-    </w:lvl>
-    <w:lvl w:ilvl="3" w:tplc="04090001" w:tentative="1">
-      <w:start w:val="1"/>
-      <w:numFmt w:val="bullet"/>
-      <w:lvlText w:val=""/>
-      <w:lvlJc w:val="left"/>
-      <w:pPr>
-        <w:tabs>
-          <w:tab w:val="num" w:pos="2878"/>
-        </w:tabs>
-        <w:ind w:left="2878" w:hanging="360"/>
-      </w:pPr>
-      <w:rPr>
-        <w:rFonts w:ascii="Symbol" w:hAnsi="Symbol" w:hint="default"/>
-      </w:rPr>
-    </w:lvl>
-    <w:lvl w:ilvl="4" w:tplc="04090003" w:tentative="1">
-      <w:start w:val="1"/>
-      <w:numFmt w:val="bullet"/>
-      <w:lvlText w:val="o"/>
-      <w:lvlJc w:val="left"/>
-      <w:pPr>
-        <w:tabs>
-          <w:tab w:val="num" w:pos="3598"/>
-        </w:tabs>
-        <w:ind w:left="3598" w:hanging="360"/>
-      </w:pPr>
-      <w:rPr>
-        <w:rFonts w:ascii="Courier New" w:hAnsi="Courier New" w:hint="default"/>
-      </w:rPr>
-    </w:lvl>
-    <w:lvl w:ilvl="5" w:tplc="04090005" w:tentative="1">
-      <w:start w:val="1"/>
-      <w:numFmt w:val="bullet"/>
-      <w:lvlText w:val=""/>
-      <w:lvlJc w:val="left"/>
-      <w:pPr>
-        <w:tabs>
-          <w:tab w:val="num" w:pos="4318"/>
-        </w:tabs>
-        <w:ind w:left="4318" w:hanging="360"/>
-      </w:pPr>
-      <w:rPr>
-        <w:rFonts w:ascii="Wingdings" w:hAnsi="Wingdings" w:hint="default"/>
-      </w:rPr>
-    </w:lvl>
-    <w:lvl w:ilvl="6" w:tplc="04090001" w:tentative="1">
-      <w:start w:val="1"/>
-      <w:numFmt w:val="bullet"/>
-      <w:lvlText w:val=""/>
-      <w:lvlJc w:val="left"/>
-      <w:pPr>
-        <w:tabs>
-          <w:tab w:val="num" w:pos="5038"/>
-        </w:tabs>
-        <w:ind w:left="5038" w:hanging="360"/>
-      </w:pPr>
-      <w:rPr>
-        <w:rFonts w:ascii="Symbol" w:hAnsi="Symbol" w:hint="default"/>
-      </w:rPr>
-    </w:lvl>
-    <w:lvl w:ilvl="7" w:tplc="04090003" w:tentative="1">
-      <w:start w:val="1"/>
-      <w:numFmt w:val="bullet"/>
-      <w:lvlText w:val="o"/>
-      <w:lvlJc w:val="left"/>
-      <w:pPr>
-        <w:tabs>
-          <w:tab w:val="num" w:pos="5758"/>
-        </w:tabs>
-        <w:ind w:left="5758" w:hanging="360"/>
-      </w:pPr>
-      <w:rPr>
-        <w:rFonts w:ascii="Courier New" w:hAnsi="Courier New" w:hint="default"/>
-      </w:rPr>
-    </w:lvl>
-    <w:lvl w:ilvl="8" w:tplc="04090005" w:tentative="1">
-      <w:start w:val="1"/>
-      <w:numFmt w:val="bullet"/>
-      <w:lvlText w:val=""/>
-      <w:lvlJc w:val="left"/>
-      <w:pPr>
-        <w:tabs>
-          <w:tab w:val="num" w:pos="6478"/>
-        </w:tabs>
-        <w:ind w:left="6478" w:hanging="360"/>
-      </w:pPr>
-      <w:rPr>
-        <w:rFonts w:ascii="Wingdings" w:hAnsi="Wingdings" w:hint="default"/>
-      </w:rPr>
-    </w:lvl>
-  </w:abstractNum>
   <w:num w:numId="1" w16cid:durableId="100951716">
     <w:abstractNumId w:val="0"/>
   </w:num>
-  <w:num w:numId="2" w16cid:durableId="1977642738">
-    <w:abstractNumId w:val="12"/>
+  <w:num w:numId="2" w16cid:durableId="154028298">
+    <w:abstractNumId w:val="1"/>
   </w:num>
-  <w:num w:numId="3" w16cid:durableId="133063116">
-    <w:abstractNumId w:val="27"/>
-  </w:num>
-  <w:num w:numId="4" w16cid:durableId="614676279">
-    <w:abstractNumId w:val="19"/>
-  </w:num>
-  <w:num w:numId="5" w16cid:durableId="2134051340">
-    <w:abstractNumId w:val="18"/>
-  </w:num>
-  <w:num w:numId="6" w16cid:durableId="471799078">
-    <w:abstractNumId w:val="1"/>
-    <w:lvlOverride w:ilvl="0">
-      <w:lvl w:ilvl="0">
-        <w:numFmt w:val="bullet"/>
-        <w:lvlText w:val=""/>
-        <w:legacy w:legacy="1" w:legacySpace="0" w:legacyIndent="360"/>
-        <w:lvlJc w:val="left"/>
-        <w:pPr>
-          <w:ind w:left="720" w:hanging="360"/>
-        </w:pPr>
-        <w:rPr>
-          <w:rFonts w:ascii="Symbol" w:hAnsi="Symbol" w:hint="default"/>
-        </w:rPr>
-      </w:lvl>
-    </w:lvlOverride>
-  </w:num>
-  <w:num w:numId="7" w16cid:durableId="22555179">
-    <w:abstractNumId w:val="2"/>
-  </w:num>
-  <w:num w:numId="8" w16cid:durableId="1658069430">
-    <w:abstractNumId w:val="26"/>
-  </w:num>
-  <w:num w:numId="9" w16cid:durableId="1894076237">
-    <w:abstractNumId w:val="4"/>
-  </w:num>
-  <w:num w:numId="10" w16cid:durableId="2132553306">
-    <w:abstractNumId w:val="13"/>
-  </w:num>
-  <w:num w:numId="11" w16cid:durableId="2114132868">
-    <w:abstractNumId w:val="11"/>
-  </w:num>
-  <w:num w:numId="12" w16cid:durableId="1162895873">
-    <w:abstractNumId w:val="25"/>
-  </w:num>
-  <w:num w:numId="13" w16cid:durableId="324743573">
-    <w:abstractNumId w:val="10"/>
-  </w:num>
-  <w:num w:numId="14" w16cid:durableId="1539051147">
-    <w:abstractNumId w:val="5"/>
-  </w:num>
-  <w:num w:numId="15" w16cid:durableId="732969655">
-    <w:abstractNumId w:val="24"/>
-  </w:num>
-  <w:num w:numId="16" w16cid:durableId="925263170">
-    <w:abstractNumId w:val="17"/>
-  </w:num>
-  <w:num w:numId="17" w16cid:durableId="1316377050">
-    <w:abstractNumId w:val="7"/>
-  </w:num>
-  <w:num w:numId="18" w16cid:durableId="1430390954">
-    <w:abstractNumId w:val="16"/>
-  </w:num>
-  <w:num w:numId="19" w16cid:durableId="617874360">
-    <w:abstractNumId w:val="1"/>
-    <w:lvlOverride w:ilvl="0">
-      <w:lvl w:ilvl="0">
-        <w:start w:val="1"/>
-        <w:numFmt w:val="bullet"/>
-        <w:lvlText w:val=""/>
-        <w:legacy w:legacy="1" w:legacySpace="0" w:legacyIndent="360"/>
-        <w:lvlJc w:val="left"/>
-        <w:pPr>
-          <w:ind w:left="1080" w:hanging="360"/>
-        </w:pPr>
-        <w:rPr>
-          <w:rFonts w:ascii="Symbol" w:hAnsi="Symbol" w:hint="default"/>
-        </w:rPr>
-      </w:lvl>
-    </w:lvlOverride>
-  </w:num>
-  <w:num w:numId="20" w16cid:durableId="1372456768">
-    <w:abstractNumId w:val="9"/>
-  </w:num>
-  <w:num w:numId="21" w16cid:durableId="1506090820">
-    <w:abstractNumId w:val="22"/>
-  </w:num>
-  <w:num w:numId="22" w16cid:durableId="527568217">
-    <w:abstractNumId w:val="0"/>
-    <w:lvlOverride w:ilvl="0">
-      <w:startOverride w:val="1"/>
-    </w:lvlOverride>
-    <w:lvlOverride w:ilvl="1">
-      <w:startOverride w:val="1"/>
-    </w:lvlOverride>
-    <w:lvlOverride w:ilvl="2">
-      <w:startOverride w:val="1"/>
-    </w:lvlOverride>
-    <w:lvlOverride w:ilvl="3">
-      <w:startOverride w:val="1"/>
-    </w:lvlOverride>
-    <w:lvlOverride w:ilvl="4">
-      <w:startOverride w:val="1"/>
-    </w:lvlOverride>
-    <w:lvlOverride w:ilvl="5">
-      <w:startOverride w:val="1"/>
-    </w:lvlOverride>
-    <w:lvlOverride w:ilvl="6">
-      <w:startOverride w:val="1"/>
-    </w:lvlOverride>
-    <w:lvlOverride w:ilvl="7">
-      <w:startOverride w:val="1"/>
-    </w:lvlOverride>
-    <w:lvlOverride w:ilvl="8">
-      <w:startOverride w:val="1"/>
-    </w:lvlOverride>
-  </w:num>
-  <w:num w:numId="23" w16cid:durableId="1206793592">
-    <w:abstractNumId w:val="17"/>
-  </w:num>
-  <w:num w:numId="24" w16cid:durableId="1966887923">
-    <w:abstractNumId w:val="7"/>
-  </w:num>
-  <w:num w:numId="25" w16cid:durableId="1763180813">
-    <w:abstractNumId w:val="16"/>
-  </w:num>
-  <w:num w:numId="26" w16cid:durableId="105514926">
-    <w:abstractNumId w:val="0"/>
-  </w:num>
-  <w:num w:numId="27" w16cid:durableId="1065956786">
-    <w:abstractNumId w:val="0"/>
-  </w:num>
-  <w:num w:numId="28" w16cid:durableId="560140038">
-    <w:abstractNumId w:val="0"/>
-  </w:num>
-  <w:num w:numId="29" w16cid:durableId="199173927">
-    <w:abstractNumId w:val="0"/>
-  </w:num>
-  <w:num w:numId="30" w16cid:durableId="1137914777">
-    <w:abstractNumId w:val="0"/>
-  </w:num>
-  <w:num w:numId="31" w16cid:durableId="1073771226">
-    <w:abstractNumId w:val="0"/>
-  </w:num>
-  <w:num w:numId="32" w16cid:durableId="1705860629">
-    <w:abstractNumId w:val="0"/>
-  </w:num>
-  <w:num w:numId="33" w16cid:durableId="637613650">
-    <w:abstractNumId w:val="0"/>
-  </w:num>
-  <w:num w:numId="34" w16cid:durableId="933977937">
-    <w:abstractNumId w:val="0"/>
-  </w:num>
-  <w:num w:numId="35" w16cid:durableId="1597901249">
-    <w:abstractNumId w:val="0"/>
-  </w:num>
-  <w:num w:numId="36" w16cid:durableId="1381245236">
-    <w:abstractNumId w:val="0"/>
-  </w:num>
-  <w:num w:numId="37" w16cid:durableId="267931649">
-    <w:abstractNumId w:val="0"/>
-  </w:num>
-  <w:num w:numId="38" w16cid:durableId="258635775">
-    <w:abstractNumId w:val="0"/>
-  </w:num>
-  <w:num w:numId="39" w16cid:durableId="1278217560">
-    <w:abstractNumId w:val="0"/>
-  </w:num>
-  <w:num w:numId="40" w16cid:durableId="260796198">
-    <w:abstractNumId w:val="0"/>
-  </w:num>
-  <w:num w:numId="41" w16cid:durableId="1168129354">
-    <w:abstractNumId w:val="0"/>
-  </w:num>
-  <w:num w:numId="42" w16cid:durableId="214237854">
-    <w:abstractNumId w:val="0"/>
-  </w:num>
-  <w:num w:numId="43" w16cid:durableId="182475786">
-    <w:abstractNumId w:val="0"/>
-  </w:num>
-  <w:num w:numId="44" w16cid:durableId="693504913">
-    <w:abstractNumId w:val="0"/>
-  </w:num>
-  <w:num w:numId="45" w16cid:durableId="1670479593">
-    <w:abstractNumId w:val="0"/>
-  </w:num>
-  <w:num w:numId="46" w16cid:durableId="280039157">
-    <w:abstractNumId w:val="0"/>
-  </w:num>
-  <w:num w:numId="47" w16cid:durableId="1923221520">
-    <w:abstractNumId w:val="21"/>
-  </w:num>
-  <w:num w:numId="48" w16cid:durableId="1943223494">
-    <w:abstractNumId w:val="6"/>
-  </w:num>
-  <w:num w:numId="49" w16cid:durableId="812253944">
-    <w:abstractNumId w:val="23"/>
-  </w:num>
-  <w:num w:numId="50" w16cid:durableId="484250662">
-    <w:abstractNumId w:val="20"/>
-  </w:num>
-  <w:num w:numId="51" w16cid:durableId="530145825">
-    <w:abstractNumId w:val="15"/>
-  </w:num>
-  <w:num w:numId="52" w16cid:durableId="1504007009">
-    <w:abstractNumId w:val="28"/>
-  </w:num>
-  <w:num w:numId="53" w16cid:durableId="1814255496">
-    <w:abstractNumId w:val="14"/>
-  </w:num>
-  <w:num w:numId="54" w16cid:durableId="962685873">
-    <w:abstractNumId w:val="3"/>
-  </w:num>
-  <w:num w:numId="55" w16cid:durableId="154028298">
-    <w:abstractNumId w:val="8"/>
-  </w:num>
+  <w:numIdMacAtCleanup w:val="2"/>
 </w:numbering>
 </file>
 
@@ -5480,6 +3819,7 @@
   <w:style w:type="character" w:default="1" w:styleId="DefaultParagraphFont">
     <w:name w:val="Default Paragraph Font"/>
     <w:uiPriority w:val="1"/>
+    <w:semiHidden/>
     <w:unhideWhenUsed/>
   </w:style>
   <w:style w:type="table" w:default="1" w:styleId="TableNormal">
@@ -5818,7 +4158,7 @@
     <w:pPr>
       <w:widowControl/>
       <w:numPr>
-        <w:numId w:val="55"/>
+        <w:numId w:val="2"/>
       </w:numPr>
       <w:tabs>
         <w:tab w:val="left" w:pos="720"/>

</xml_diff>

<commit_message>
Updated my sections of SRS doc
</commit_message>
<xml_diff>
--- a/documentation/02-Software-Requirements-Spec.docx
+++ b/documentation/02-Software-Requirements-Spec.docx
@@ -250,6 +250,9 @@
             <w:pPr>
               <w:pStyle w:val="Tabletext"/>
             </w:pPr>
+            <w:r>
+              <w:t>3/11/26</w:t>
+            </w:r>
           </w:p>
         </w:tc>
         <w:tc>
@@ -260,6 +263,9 @@
             <w:pPr>
               <w:pStyle w:val="Tabletext"/>
             </w:pPr>
+            <w:r>
+              <w:t>1.1</w:t>
+            </w:r>
           </w:p>
         </w:tc>
         <w:tc>
@@ -270,6 +276,9 @@
             <w:pPr>
               <w:pStyle w:val="Tabletext"/>
             </w:pPr>
+            <w:r>
+              <w:t>Added content for sections  2.1.2, 2.1.4, 2.1.6, 2.2, 2., 2.4, 2.5</w:t>
+            </w:r>
           </w:p>
         </w:tc>
         <w:tc>
@@ -280,6 +289,9 @@
             <w:pPr>
               <w:pStyle w:val="Tabletext"/>
             </w:pPr>
+            <w:r>
+              <w:t>Alexander Wichern</w:t>
+            </w:r>
           </w:p>
         </w:tc>
       </w:tr>
@@ -2031,6 +2043,26 @@
       </w:r>
       <w:bookmarkEnd w:id="9"/>
     </w:p>
+    <w:p/>
+    <w:p>
+      <w:pPr>
+        <w:ind w:firstLine="720"/>
+      </w:pPr>
+      <w:r>
+        <w:t xml:space="preserve">The user interface will be </w:t>
+      </w:r>
+      <w:r>
+        <w:t>text-based</w:t>
+      </w:r>
+      <w:r>
+        <w:t xml:space="preserve"> command line prompts. Returning calculated values on valid expression and returning warnings and/or error messages in case of invalid input or ambiguity.</w:t>
+      </w:r>
+    </w:p>
+    <w:p>
+      <w:pPr>
+        <w:ind w:firstLine="720"/>
+      </w:pPr>
+    </w:p>
     <w:p>
       <w:pPr>
         <w:pStyle w:val="Heading3"/>
@@ -2057,6 +2089,23 @@
       </w:r>
       <w:bookmarkEnd w:id="11"/>
     </w:p>
+    <w:p/>
+    <w:p>
+      <w:pPr>
+        <w:ind w:left="720"/>
+      </w:pPr>
+      <w:r>
+        <w:t>Interacts with the C++ standard library</w:t>
+      </w:r>
+      <w:r>
+        <w:t>.</w:t>
+      </w:r>
+    </w:p>
+    <w:p>
+      <w:pPr>
+        <w:ind w:left="720"/>
+      </w:pPr>
+    </w:p>
     <w:p>
       <w:pPr>
         <w:pStyle w:val="Heading3"/>
@@ -2083,6 +2132,26 @@
       </w:r>
       <w:bookmarkEnd w:id="13"/>
     </w:p>
+    <w:p/>
+    <w:p>
+      <w:pPr>
+        <w:ind w:firstLine="720"/>
+      </w:pPr>
+      <w:r>
+        <w:t>None specified, don</w:t>
+      </w:r>
+      <w:r>
+        <w:t>’</w:t>
+      </w:r>
+      <w:r>
+        <w:t>t overflow the stack on nested parentheses.</w:t>
+      </w:r>
+    </w:p>
+    <w:p>
+      <w:pPr>
+        <w:ind w:left="720"/>
+      </w:pPr>
+    </w:p>
     <w:p>
       <w:pPr>
         <w:pStyle w:val="Heading3"/>
@@ -2109,6 +2178,25 @@
       </w:r>
       <w:bookmarkEnd w:id="15"/>
     </w:p>
+    <w:p/>
+    <w:p>
+      <w:pPr>
+        <w:ind w:firstLine="720"/>
+      </w:pPr>
+      <w:r>
+        <w:t xml:space="preserve">The software will tokenize user input and evaluate user expressions. This includes maintaining correct order of operations and handling precedence in the case of parentheses (PEMDAS). The software will also handle unary operators (signage and inc/decrementing) as well as error handling on invalid or ambiguous inputs. </w:t>
+      </w:r>
+    </w:p>
+    <w:p>
+      <w:pPr>
+        <w:ind w:left="720"/>
+      </w:pPr>
+    </w:p>
+    <w:p>
+      <w:pPr>
+        <w:ind w:left="720"/>
+      </w:pPr>
+    </w:p>
     <w:p>
       <w:pPr>
         <w:pStyle w:val="Heading2"/>
@@ -2119,6 +2207,23 @@
       </w:r>
       <w:bookmarkEnd w:id="16"/>
     </w:p>
+    <w:p/>
+    <w:p>
+      <w:pPr>
+        <w:ind w:left="720"/>
+      </w:pPr>
+      <w:r>
+        <w:t>Users are anyone who has a basic understanding of mathematics</w:t>
+      </w:r>
+      <w:r>
+        <w:t>.</w:t>
+      </w:r>
+    </w:p>
+    <w:p>
+      <w:pPr>
+        <w:ind w:left="720"/>
+      </w:pPr>
+    </w:p>
     <w:p>
       <w:pPr>
         <w:pStyle w:val="Heading2"/>
@@ -2129,6 +2234,21 @@
       </w:r>
       <w:bookmarkEnd w:id="17"/>
     </w:p>
+    <w:p/>
+    <w:p>
+      <w:pPr>
+        <w:ind w:firstLine="720"/>
+      </w:pPr>
+      <w:r>
+        <w:t xml:space="preserve">Must be written in </w:t>
+      </w:r>
+      <w:r>
+        <w:t>C++</w:t>
+      </w:r>
+      <w:r>
+        <w:t>, utilize object-oriented design, have unit test to verify correctness, ensure that the program provides clear and informative messages upon invalid input</w:t>
+      </w:r>
+    </w:p>
     <w:p>
       <w:pPr>
         <w:pStyle w:val="Heading2"/>
@@ -2139,6 +2259,15 @@
       </w:r>
       <w:bookmarkEnd w:id="18"/>
     </w:p>
+    <w:p/>
+    <w:p>
+      <w:pPr>
+        <w:ind w:left="720"/>
+      </w:pPr>
+      <w:r>
+        <w:t>Inputs are signed integers</w:t>
+      </w:r>
+    </w:p>
     <w:p>
       <w:pPr>
         <w:pStyle w:val="Heading2"/>
@@ -2151,6 +2280,7 @@
         <w:rPr>
           <w:highlight w:val="yellow"/>
         </w:rPr>
+        <w:lastRenderedPageBreak/>
         <w:t>Requirements subsets</w:t>
       </w:r>
       <w:bookmarkEnd w:id="19"/>
@@ -2216,15 +2346,7 @@
         <w:t>SRS</w:t>
       </w:r>
       <w:r>
-        <w:t xml:space="preserve"> package and thought should be given to the organization of this section. This section is typically organized by feature, but alternative organization methods may also be </w:t>
-      </w:r>
-      <w:proofErr w:type="gramStart"/>
-      <w:r>
-        <w:t>appropriate;</w:t>
-      </w:r>
-      <w:proofErr w:type="gramEnd"/>
-      <w:r>
-        <w:t xml:space="preserve"> for example, organization by user or organization by subsystem. Functional requirements may include feature sets, capabilities, and security.</w:t>
+        <w:t xml:space="preserve"> package and thought should be given to the organization of this section. This section is typically organized by feature, but alternative organization methods may also be appropriate; for example, organization by user or organization by subsystem. Functional requirements may include feature sets, capabilities, and security.</w:t>
       </w:r>
     </w:p>
     <w:p>
@@ -2241,7 +2363,6 @@
       </w:pPr>
       <w:bookmarkStart w:id="22" w:name="_Toc5537909"/>
       <w:r>
-        <w:lastRenderedPageBreak/>
         <w:t>&lt;Functional Requirement One&gt;</w:t>
       </w:r>
       <w:bookmarkEnd w:id="22"/>
@@ -2274,15 +2395,7 @@
         <w:pStyle w:val="InfoBlue"/>
       </w:pPr>
       <w:r>
-        <w:t xml:space="preserve">[In use-case modeling, the use cases often define </w:t>
-      </w:r>
-      <w:proofErr w:type="gramStart"/>
-      <w:r>
-        <w:t>the majority of</w:t>
-      </w:r>
-      <w:proofErr w:type="gramEnd"/>
-      <w:r>
-        <w:t xml:space="preserve"> the functional requirements of the system, along with some non-functional requirements.]</w:t>
+        <w:t>[In use-case modeling, the use cases often define the majority of the functional requirements of the system, along with some non-functional requirements.]</w:t>
       </w:r>
     </w:p>
     <w:p>
@@ -2525,6 +2638,7 @@
       </w:pPr>
       <w:bookmarkStart w:id="28" w:name="_Toc5537913"/>
       <w:r>
+        <w:lastRenderedPageBreak/>
         <w:t>Appendi</w:t>
       </w:r>
       <w:r>
@@ -2550,15 +2664,7 @@
         <w:t>SRS</w:t>
       </w:r>
       <w:r>
-        <w:t xml:space="preserve"> should explicitly state </w:t>
-      </w:r>
-      <w:proofErr w:type="gramStart"/>
-      <w:r>
-        <w:t>whether or not</w:t>
-      </w:r>
-      <w:proofErr w:type="gramEnd"/>
-      <w:r>
-        <w:t xml:space="preserve"> the appendices are to be considered part of the requirements]</w:t>
+        <w:t xml:space="preserve"> should explicitly state whether or not the appendices are to be considered part of the requirements]</w:t>
       </w:r>
     </w:p>
     <w:p>
@@ -5480,6 +5586,7 @@
   <w:style w:type="character" w:default="1" w:styleId="DefaultParagraphFont">
     <w:name w:val="Default Paragraph Font"/>
     <w:uiPriority w:val="1"/>
+    <w:semiHidden/>
     <w:unhideWhenUsed/>
   </w:style>
   <w:style w:type="table" w:default="1" w:styleId="TableNormal">

</xml_diff>